<commit_message>
Reduce night-guard report to the two simulated scenarios
The workbook has two scenarios (conservative and moderate). The
moderate scenario without the 22:00 service window is now a note inside
alternative 2 instead of a separate third case.

Co-Authored-By: Claude Opus 5.5 <noreply@anthropic.com>
Claude-Session: https://claude.ai/code/session_01AawrgrtCbBWdXknuaYBp6W
</commit_message>
<xml_diff>
--- a/guardia_nocturno_alternativas/Retiro_guardia_nocturno_alternativas.docx
+++ b/guardia_nocturno_alternativas/Retiro_guardia_nocturno_alternativas.docx
@@ -23,7 +23,7 @@
         <w:spacing w:after="140"/>
       </w:pPr>
       <w:r>
-        <w:t xml:space="preserve">Se proponen tres alternativas para retirar el guardia nocturno. Las tres conservan el guardia en farmacias con robo organizado de noche y difieren en cómo identifican el riesgo de violencia en la CDMX: la alternativa 1 usa la alcaldía y las alternativas 2 y 3 la colonia. La alternativa 1 retira 79 guardias y ahorra $22.5 millones al año, el 16.0% del gasto actual. La alternativa 2 retira 108 y ahorra $30.4 millones (21.7%). La alternativa 3 retira 111, adelanta la ventanilla a las 22:00 en tres farmacias y ahorra $31.2 millones (22.2%). Los turnos matutino y vespertino no se modifican.</w:t>
+        <w:t xml:space="preserve">Se proponen dos alternativas para retirar el guardia nocturno. Las dos lo conservan en farmacias con robo organizado de noche y difieren en cómo identifican el riesgo de violencia en la CDMX: la alternativa 1 usa la alcaldía y la alternativa 2 la colonia. La alternativa 1 retira 79 guardias y ahorra $22.5 millones al año, el 16.0% del gasto actual. La alternativa 2 retira 111, adelanta la ventanilla a las 22:00 en tres farmacias y ahorra $31.2 millones al año (22.2%). Los turnos matutino y vespertino no se modifican.</w:t>
       </w:r>
     </w:p>
     <w:p>
@@ -1830,7 +1830,7 @@
         <w:spacing w:after="140"/>
       </w:pPr>
       <w:r>
-        <w:t xml:space="preserve">El riesgo nocturno está en la hora previa al cambio a ventanilla. A esa hora se dirigen los criterios del punto 3.5 y el adelanto de ventanilla de la alternativa 3.</w:t>
+        <w:t xml:space="preserve">El riesgo nocturno está en la hora previa al cambio a ventanilla. A esa hora se dirigen los criterios del punto 3.5 y el adelanto de ventanilla de la alternativa 2.</w:t>
       </w:r>
     </w:p>
     <w:p>
@@ -1896,7 +1896,7 @@
         <w:spacing w:after="140"/>
       </w:pPr>
       <w:r>
-        <w:t xml:space="preserve">El retiro no es general. En cada farmacia se revisa si existe alguna condición que justifique mantener el guardia nocturno. Las tres alternativas aplican los mismos criterios en las farmacias foráneas y difieren en la CDMX.</w:t>
+        <w:t xml:space="preserve">El retiro no es general. En cada farmacia se revisa si existe alguna condición que justifique mantener el guardia nocturno. Las dos alternativas aplican los mismos criterios en las farmacias foráneas y difieren en la CDMX.</w:t>
       </w:r>
     </w:p>
     <w:tbl>
@@ -1912,11 +1912,10 @@
         </w:tblBorders>
       </w:tblPr>
       <w:tblGrid>
-        <w:gridCol w:w="1500"/>
-        <w:gridCol w:w="2760"/>
         <w:gridCol w:w="1700"/>
-        <w:gridCol w:w="1700"/>
-        <w:gridCol w:w="1700"/>
+        <w:gridCol w:w="3260"/>
+        <w:gridCol w:w="2200"/>
+        <w:gridCol w:w="2200"/>
       </w:tblGrid>
       <w:tr>
         <w:trPr>
@@ -1925,7 +1924,7 @@
         </w:trPr>
         <w:tc>
           <w:tcPr>
-            <w:tcW w:type="dxa" w:w="1500"/>
+            <w:tcW w:type="dxa" w:w="1700"/>
             <w:shd w:fill="1B3A5C" w:color="auto" w:val="clear"/>
             <w:tcMar>
               <w:top w:type="dxa" w:w="60"/>
@@ -1953,7 +1952,7 @@
         </w:tc>
         <w:tc>
           <w:tcPr>
-            <w:tcW w:type="dxa" w:w="2760"/>
+            <w:tcW w:type="dxa" w:w="3260"/>
             <w:shd w:fill="1B3A5C" w:color="auto" w:val="clear"/>
             <w:tcMar>
               <w:top w:type="dxa" w:w="60"/>
@@ -1981,7 +1980,7 @@
         </w:tc>
         <w:tc>
           <w:tcPr>
-            <w:tcW w:type="dxa" w:w="1700"/>
+            <w:tcW w:type="dxa" w:w="2200"/>
             <w:shd w:fill="1B3A5C" w:color="auto" w:val="clear"/>
             <w:tcMar>
               <w:top w:type="dxa" w:w="60"/>
@@ -2009,7 +2008,7 @@
         </w:tc>
         <w:tc>
           <w:tcPr>
-            <w:tcW w:type="dxa" w:w="1700"/>
+            <w:tcW w:type="dxa" w:w="2200"/>
             <w:shd w:fill="1B3A5C" w:color="auto" w:val="clear"/>
             <w:tcMar>
               <w:top w:type="dxa" w:w="60"/>
@@ -2032,34 +2031,6 @@
                 <w:szCs w:val="18"/>
               </w:rPr>
               <w:t xml:space="preserve">Alternativa 2</w:t>
-            </w:r>
-          </w:p>
-        </w:tc>
-        <w:tc>
-          <w:tcPr>
-            <w:tcW w:type="dxa" w:w="1700"/>
-            <w:shd w:fill="1B3A5C" w:color="auto" w:val="clear"/>
-            <w:tcMar>
-              <w:top w:type="dxa" w:w="60"/>
-              <w:left w:type="dxa" w:w="100"/>
-              <w:bottom w:type="dxa" w:w="60"/>
-              <w:right w:type="dxa" w:w="100"/>
-            </w:tcMar>
-          </w:tcPr>
-          <w:p>
-            <w:pPr>
-              <w:keepNext/>
-              <w:jc w:val="center"/>
-            </w:pPr>
-            <w:r>
-              <w:rPr>
-                <w:b/>
-                <w:bCs/>
-                <w:color w:val="FFFFFF"/>
-                <w:sz w:val="18"/>
-                <w:szCs w:val="18"/>
-              </w:rPr>
-              <w:t xml:space="preserve">Alternativa 3</w:t>
             </w:r>
           </w:p>
         </w:tc>
@@ -2071,7 +2042,7 @@
         </w:trPr>
         <w:tc>
           <w:tcPr>
-            <w:tcW w:type="dxa" w:w="1500"/>
+            <w:tcW w:type="dxa" w:w="1700"/>
             <w:tcMar>
               <w:top w:type="dxa" w:w="60"/>
               <w:left w:type="dxa" w:w="100"/>
@@ -2098,7 +2069,7 @@
         </w:tc>
         <w:tc>
           <w:tcPr>
-            <w:tcW w:type="dxa" w:w="2760"/>
+            <w:tcW w:type="dxa" w:w="3260"/>
             <w:tcMar>
               <w:top w:type="dxa" w:w="60"/>
               <w:left w:type="dxa" w:w="100"/>
@@ -2125,7 +2096,7 @@
         </w:tc>
         <w:tc>
           <w:tcPr>
-            <w:tcW w:type="dxa" w:w="1700"/>
+            <w:tcW w:type="dxa" w:w="2200"/>
             <w:tcMar>
               <w:top w:type="dxa" w:w="60"/>
               <w:left w:type="dxa" w:w="100"/>
@@ -2152,34 +2123,7 @@
         </w:tc>
         <w:tc>
           <w:tcPr>
-            <w:tcW w:type="dxa" w:w="1700"/>
-            <w:tcMar>
-              <w:top w:type="dxa" w:w="60"/>
-              <w:left w:type="dxa" w:w="100"/>
-              <w:bottom w:type="dxa" w:w="60"/>
-              <w:right w:type="dxa" w:w="100"/>
-            </w:tcMar>
-          </w:tcPr>
-          <w:p>
-            <w:pPr>
-              <w:keepNext/>
-              <w:jc w:val="center"/>
-            </w:pPr>
-            <w:r>
-              <w:rPr>
-                <w:b w:val="false"/>
-                <w:bCs w:val="false"/>
-                <w:color w:val="000000"/>
-                <w:sz w:val="18"/>
-                <w:szCs w:val="18"/>
-              </w:rPr>
-              <w:t xml:space="preserve">Conserva solo en foráneas</w:t>
-            </w:r>
-          </w:p>
-        </w:tc>
-        <w:tc>
-          <w:tcPr>
-            <w:tcW w:type="dxa" w:w="1700"/>
+            <w:tcW w:type="dxa" w:w="2200"/>
             <w:tcMar>
               <w:top w:type="dxa" w:w="60"/>
               <w:left w:type="dxa" w:w="100"/>
@@ -2212,7 +2156,7 @@
         </w:trPr>
         <w:tc>
           <w:tcPr>
-            <w:tcW w:type="dxa" w:w="1500"/>
+            <w:tcW w:type="dxa" w:w="1700"/>
             <w:shd w:fill="EEF3F9" w:color="auto" w:val="clear"/>
             <w:tcMar>
               <w:top w:type="dxa" w:w="60"/>
@@ -2240,7 +2184,7 @@
         </w:tc>
         <w:tc>
           <w:tcPr>
-            <w:tcW w:type="dxa" w:w="2760"/>
+            <w:tcW w:type="dxa" w:w="3260"/>
             <w:shd w:fill="EEF3F9" w:color="auto" w:val="clear"/>
             <w:tcMar>
               <w:top w:type="dxa" w:w="60"/>
@@ -2268,7 +2212,7 @@
         </w:tc>
         <w:tc>
           <w:tcPr>
-            <w:tcW w:type="dxa" w:w="1700"/>
+            <w:tcW w:type="dxa" w:w="2200"/>
             <w:shd w:fill="EEF3F9" w:color="auto" w:val="clear"/>
             <w:tcMar>
               <w:top w:type="dxa" w:w="60"/>
@@ -2296,35 +2240,7 @@
         </w:tc>
         <w:tc>
           <w:tcPr>
-            <w:tcW w:type="dxa" w:w="1700"/>
-            <w:shd w:fill="EEF3F9" w:color="auto" w:val="clear"/>
-            <w:tcMar>
-              <w:top w:type="dxa" w:w="60"/>
-              <w:left w:type="dxa" w:w="100"/>
-              <w:bottom w:type="dxa" w:w="60"/>
-              <w:right w:type="dxa" w:w="100"/>
-            </w:tcMar>
-          </w:tcPr>
-          <w:p>
-            <w:pPr>
-              <w:keepNext/>
-              <w:jc w:val="center"/>
-            </w:pPr>
-            <w:r>
-              <w:rPr>
-                <w:b w:val="false"/>
-                <w:bCs w:val="false"/>
-                <w:color w:val="000000"/>
-                <w:sz w:val="18"/>
-                <w:szCs w:val="18"/>
-              </w:rPr>
-              <w:t xml:space="preserve">Se sustituye por el criterio de colonia</w:t>
-            </w:r>
-          </w:p>
-        </w:tc>
-        <w:tc>
-          <w:tcPr>
-            <w:tcW w:type="dxa" w:w="1700"/>
+            <w:tcW w:type="dxa" w:w="2200"/>
             <w:shd w:fill="EEF3F9" w:color="auto" w:val="clear"/>
             <w:tcMar>
               <w:top w:type="dxa" w:w="60"/>
@@ -2358,7 +2274,7 @@
         </w:trPr>
         <w:tc>
           <w:tcPr>
-            <w:tcW w:type="dxa" w:w="1500"/>
+            <w:tcW w:type="dxa" w:w="1700"/>
             <w:tcMar>
               <w:top w:type="dxa" w:w="60"/>
               <w:left w:type="dxa" w:w="100"/>
@@ -2385,7 +2301,7 @@
         </w:tc>
         <w:tc>
           <w:tcPr>
-            <w:tcW w:type="dxa" w:w="2760"/>
+            <w:tcW w:type="dxa" w:w="3260"/>
             <w:tcMar>
               <w:top w:type="dxa" w:w="60"/>
               <w:left w:type="dxa" w:w="100"/>
@@ -2412,7 +2328,7 @@
         </w:tc>
         <w:tc>
           <w:tcPr>
-            <w:tcW w:type="dxa" w:w="1700"/>
+            <w:tcW w:type="dxa" w:w="2200"/>
             <w:tcMar>
               <w:top w:type="dxa" w:w="60"/>
               <w:left w:type="dxa" w:w="100"/>
@@ -2439,34 +2355,7 @@
         </w:tc>
         <w:tc>
           <w:tcPr>
-            <w:tcW w:type="dxa" w:w="1700"/>
-            <w:tcMar>
-              <w:top w:type="dxa" w:w="60"/>
-              <w:left w:type="dxa" w:w="100"/>
-              <w:bottom w:type="dxa" w:w="60"/>
-              <w:right w:type="dxa" w:w="100"/>
-            </w:tcMar>
-          </w:tcPr>
-          <w:p>
-            <w:pPr>
-              <w:keepNext/>
-              <w:jc w:val="center"/>
-            </w:pPr>
-            <w:r>
-              <w:rPr>
-                <w:b w:val="false"/>
-                <w:bCs w:val="false"/>
-                <w:color w:val="000000"/>
-                <w:sz w:val="18"/>
-                <w:szCs w:val="18"/>
-              </w:rPr>
-              <w:t xml:space="preserve">Conserva</w:t>
-            </w:r>
-          </w:p>
-        </w:tc>
-        <w:tc>
-          <w:tcPr>
-            <w:tcW w:type="dxa" w:w="1700"/>
+            <w:tcW w:type="dxa" w:w="2200"/>
             <w:tcMar>
               <w:top w:type="dxa" w:w="60"/>
               <w:left w:type="dxa" w:w="100"/>
@@ -2499,7 +2388,7 @@
         </w:trPr>
         <w:tc>
           <w:tcPr>
-            <w:tcW w:type="dxa" w:w="1500"/>
+            <w:tcW w:type="dxa" w:w="1700"/>
             <w:shd w:fill="EEF3F9" w:color="auto" w:val="clear"/>
             <w:tcMar>
               <w:top w:type="dxa" w:w="60"/>
@@ -2527,7 +2416,7 @@
         </w:tc>
         <w:tc>
           <w:tcPr>
-            <w:tcW w:type="dxa" w:w="2760"/>
+            <w:tcW w:type="dxa" w:w="3260"/>
             <w:shd w:fill="EEF3F9" w:color="auto" w:val="clear"/>
             <w:tcMar>
               <w:top w:type="dxa" w:w="60"/>
@@ -2555,7 +2444,7 @@
         </w:tc>
         <w:tc>
           <w:tcPr>
-            <w:tcW w:type="dxa" w:w="1700"/>
+            <w:tcW w:type="dxa" w:w="2200"/>
             <w:shd w:fill="EEF3F9" w:color="auto" w:val="clear"/>
             <w:tcMar>
               <w:top w:type="dxa" w:w="60"/>
@@ -2583,35 +2472,7 @@
         </w:tc>
         <w:tc>
           <w:tcPr>
-            <w:tcW w:type="dxa" w:w="1700"/>
-            <w:shd w:fill="EEF3F9" w:color="auto" w:val="clear"/>
-            <w:tcMar>
-              <w:top w:type="dxa" w:w="60"/>
-              <w:left w:type="dxa" w:w="100"/>
-              <w:bottom w:type="dxa" w:w="60"/>
-              <w:right w:type="dxa" w:w="100"/>
-            </w:tcMar>
-          </w:tcPr>
-          <w:p>
-            <w:pPr>
-              <w:keepNext/>
-              <w:jc w:val="center"/>
-            </w:pPr>
-            <w:r>
-              <w:rPr>
-                <w:b w:val="false"/>
-                <w:bCs w:val="false"/>
-                <w:color w:val="000000"/>
-                <w:sz w:val="18"/>
-                <w:szCs w:val="18"/>
-              </w:rPr>
-              <w:t xml:space="preserve">Conserva con 3 o más en la CDMX y 2 o más en foráneas</w:t>
-            </w:r>
-          </w:p>
-        </w:tc>
-        <w:tc>
-          <w:tcPr>
-            <w:tcW w:type="dxa" w:w="1700"/>
+            <w:tcW w:type="dxa" w:w="2200"/>
             <w:shd w:fill="EEF3F9" w:color="auto" w:val="clear"/>
             <w:tcMar>
               <w:top w:type="dxa" w:w="60"/>
@@ -2645,7 +2506,7 @@
         </w:trPr>
         <w:tc>
           <w:tcPr>
-            <w:tcW w:type="dxa" w:w="1500"/>
+            <w:tcW w:type="dxa" w:w="1700"/>
             <w:tcMar>
               <w:top w:type="dxa" w:w="60"/>
               <w:left w:type="dxa" w:w="100"/>
@@ -2672,7 +2533,7 @@
         </w:tc>
         <w:tc>
           <w:tcPr>
-            <w:tcW w:type="dxa" w:w="2760"/>
+            <w:tcW w:type="dxa" w:w="3260"/>
             <w:tcMar>
               <w:top w:type="dxa" w:w="60"/>
               <w:left w:type="dxa" w:w="100"/>
@@ -2699,7 +2560,7 @@
         </w:tc>
         <w:tc>
           <w:tcPr>
-            <w:tcW w:type="dxa" w:w="1700"/>
+            <w:tcW w:type="dxa" w:w="2200"/>
             <w:tcMar>
               <w:top w:type="dxa" w:w="60"/>
               <w:left w:type="dxa" w:w="100"/>
@@ -2726,34 +2587,7 @@
         </w:tc>
         <w:tc>
           <w:tcPr>
-            <w:tcW w:type="dxa" w:w="1700"/>
-            <w:tcMar>
-              <w:top w:type="dxa" w:w="60"/>
-              <w:left w:type="dxa" w:w="100"/>
-              <w:bottom w:type="dxa" w:w="60"/>
-              <w:right w:type="dxa" w:w="100"/>
-            </w:tcMar>
-          </w:tcPr>
-          <w:p>
-            <w:pPr>
-              <w:keepNext/>
-              <w:jc w:val="center"/>
-            </w:pPr>
-            <w:r>
-              <w:rPr>
-                <w:b w:val="false"/>
-                <w:bCs w:val="false"/>
-                <w:color w:val="000000"/>
-                <w:sz w:val="18"/>
-                <w:szCs w:val="18"/>
-              </w:rPr>
-              <w:t xml:space="preserve">Conserva</w:t>
-            </w:r>
-          </w:p>
-        </w:tc>
-        <w:tc>
-          <w:tcPr>
-            <w:tcW w:type="dxa" w:w="1700"/>
+            <w:tcW w:type="dxa" w:w="2200"/>
             <w:tcMar>
               <w:top w:type="dxa" w:w="60"/>
               <w:left w:type="dxa" w:w="100"/>
@@ -2786,7 +2620,7 @@
         </w:trPr>
         <w:tc>
           <w:tcPr>
-            <w:tcW w:type="dxa" w:w="1500"/>
+            <w:tcW w:type="dxa" w:w="1700"/>
             <w:shd w:fill="EEF3F9" w:color="auto" w:val="clear"/>
             <w:tcMar>
               <w:top w:type="dxa" w:w="60"/>
@@ -2814,7 +2648,7 @@
         </w:tc>
         <w:tc>
           <w:tcPr>
-            <w:tcW w:type="dxa" w:w="2760"/>
+            <w:tcW w:type="dxa" w:w="3260"/>
             <w:shd w:fill="EEF3F9" w:color="auto" w:val="clear"/>
             <w:tcMar>
               <w:top w:type="dxa" w:w="60"/>
@@ -2842,7 +2676,7 @@
         </w:tc>
         <w:tc>
           <w:tcPr>
-            <w:tcW w:type="dxa" w:w="1700"/>
+            <w:tcW w:type="dxa" w:w="2200"/>
             <w:shd w:fill="EEF3F9" w:color="auto" w:val="clear"/>
             <w:tcMar>
               <w:top w:type="dxa" w:w="60"/>
@@ -2870,35 +2704,7 @@
         </w:tc>
         <w:tc>
           <w:tcPr>
-            <w:tcW w:type="dxa" w:w="1700"/>
-            <w:shd w:fill="EEF3F9" w:color="auto" w:val="clear"/>
-            <w:tcMar>
-              <w:top w:type="dxa" w:w="60"/>
-              <w:left w:type="dxa" w:w="100"/>
-              <w:bottom w:type="dxa" w:w="60"/>
-              <w:right w:type="dxa" w:w="100"/>
-            </w:tcMar>
-          </w:tcPr>
-          <w:p>
-            <w:pPr>
-              <w:keepNext w:val="false"/>
-              <w:jc w:val="center"/>
-            </w:pPr>
-            <w:r>
-              <w:rPr>
-                <w:b w:val="false"/>
-                <w:bCs w:val="false"/>
-                <w:color w:val="000000"/>
-                <w:sz w:val="18"/>
-                <w:szCs w:val="18"/>
-              </w:rPr>
-              <w:t xml:space="preserve">Sin cambio hasta revisarse</w:t>
-            </w:r>
-          </w:p>
-        </w:tc>
-        <w:tc>
-          <w:tcPr>
-            <w:tcW w:type="dxa" w:w="1700"/>
+            <w:tcW w:type="dxa" w:w="2200"/>
             <w:shd w:fill="EEF3F9" w:color="auto" w:val="clear"/>
             <w:tcMar>
               <w:top w:type="dxa" w:w="60"/>
@@ -2936,7 +2742,7 @@
         <w:spacing w:after="140"/>
       </w:pPr>
       <w:r>
-        <w:t xml:space="preserve">Una farmacia cumple el criterio de colonia si su colonia está en el 20% más alto de carpetas de robo a negocio con violencia entre las farmacias de la CDMX, en total o de 20:00 a 23:59 con un mínimo de 3 carpetas. Cumplen 21 farmacias. F119 Stim queda en revisión porque su colonia no tiene coincidencia en la base de la FGJ, y mientras tanto conserva el guardia en las alternativas 2 y 3.</w:t>
+        <w:t xml:space="preserve">Una farmacia cumple el criterio de colonia si su colonia está en el 20% más alto de carpetas de robo a negocio con violencia entre las farmacias de la CDMX, en total o de 20:00 a 23:59 con un mínimo de 3 carpetas. Cumplen 21 farmacias. F119 Stim queda en revisión porque su colonia no tiene coincidencia en la base de la FGJ, y mientras tanto conserva el guardia en la alternativa 2.</w:t>
       </w:r>
     </w:p>
     <w:p>
@@ -2952,7 +2758,7 @@
         <w:spacing w:after="140"/>
       </w:pPr>
       <w:r>
-        <w:t xml:space="preserve">Las farmacias foráneas tienen la misma regla en las tres alternativas, porque fuera de la CDMX no se cuenta con información de violencia por colonia.</w:t>
+        <w:t xml:space="preserve">Las farmacias foráneas tienen la misma regla en las dos alternativas, porque fuera de la CDMX no se cuenta con información de violencia por colonia.</w:t>
       </w:r>
     </w:p>
     <w:p>
@@ -2968,7 +2774,7 @@
         <w:spacing w:after="140"/>
       </w:pPr>
       <w:r>
-        <w:t xml:space="preserve">Los montos están calculados a costo de contrato del Semáforo y no incluyen costos de transición. La alternativa 1 corresponde al escenario conservador de la simulación, y las alternativas 2 y 3 al escenario moderado sin y con ventanilla anticipada.</w:t>
+        <w:t xml:space="preserve">Los montos están calculados a costo de contrato del Semáforo y no incluyen costos de transición. La alternativa 1 corresponde al escenario conservador de la simulación y la alternativa 2 al escenario moderado.</w:t>
       </w:r>
     </w:p>
     <w:p>
@@ -3448,7 +3254,7 @@
           </w:tcPr>
           <w:p>
             <w:pPr>
-              <w:keepNext/>
+              <w:keepNext w:val="false"/>
               <w:jc w:val="left"/>
             </w:pPr>
             <w:r>
@@ -3475,18 +3281,18 @@
           </w:tcPr>
           <w:p>
             <w:pPr>
-              <w:keepNext/>
-              <w:jc w:val="center"/>
-            </w:pPr>
-            <w:r>
-              <w:rPr>
-                <w:b w:val="false"/>
-                <w:bCs w:val="false"/>
-                <w:color w:val="000000"/>
-                <w:sz w:val="18"/>
-                <w:szCs w:val="18"/>
-              </w:rPr>
-              <w:t xml:space="preserve">397</w:t>
+              <w:keepNext w:val="false"/>
+              <w:jc w:val="center"/>
+            </w:pPr>
+            <w:r>
+              <w:rPr>
+                <w:b w:val="false"/>
+                <w:bCs w:val="false"/>
+                <w:color w:val="000000"/>
+                <w:sz w:val="18"/>
+                <w:szCs w:val="18"/>
+              </w:rPr>
+              <w:t xml:space="preserve">394</w:t>
             </w:r>
           </w:p>
         </w:tc>
@@ -3502,18 +3308,18 @@
           </w:tcPr>
           <w:p>
             <w:pPr>
-              <w:keepNext/>
-              <w:jc w:val="center"/>
-            </w:pPr>
-            <w:r>
-              <w:rPr>
-                <w:b w:val="false"/>
-                <w:bCs w:val="false"/>
-                <w:color w:val="000000"/>
-                <w:sz w:val="18"/>
-                <w:szCs w:val="18"/>
-              </w:rPr>
-              <w:t xml:space="preserve">$110,078,665</w:t>
+              <w:keepNext w:val="false"/>
+              <w:jc w:val="center"/>
+            </w:pPr>
+            <w:r>
+              <w:rPr>
+                <w:b w:val="false"/>
+                <w:bCs w:val="false"/>
+                <w:color w:val="000000"/>
+                <w:sz w:val="18"/>
+                <w:szCs w:val="18"/>
+              </w:rPr>
+              <w:t xml:space="preserve">$109,257,865</w:t>
             </w:r>
           </w:p>
         </w:tc>
@@ -3529,170 +3335,24 @@
           </w:tcPr>
           <w:p>
             <w:pPr>
-              <w:keepNext/>
-              <w:jc w:val="center"/>
-            </w:pPr>
-            <w:r>
-              <w:rPr>
-                <w:b w:val="false"/>
-                <w:bCs w:val="false"/>
-                <w:color w:val="000000"/>
-                <w:sz w:val="18"/>
-                <w:szCs w:val="18"/>
-              </w:rPr>
-              <w:t xml:space="preserve">$30,421,789</w:t>
+              <w:keepNext w:val="false"/>
+              <w:jc w:val="center"/>
+            </w:pPr>
+            <w:r>
+              <w:rPr>
+                <w:b w:val="false"/>
+                <w:bCs w:val="false"/>
+                <w:color w:val="000000"/>
+                <w:sz w:val="18"/>
+                <w:szCs w:val="18"/>
+              </w:rPr>
+              <w:t xml:space="preserve">$31,242,589</w:t>
             </w:r>
           </w:p>
         </w:tc>
         <w:tc>
           <w:tcPr>
             <w:tcW w:type="dxa" w:w="1300"/>
-            <w:tcMar>
-              <w:top w:type="dxa" w:w="60"/>
-              <w:left w:type="dxa" w:w="100"/>
-              <w:bottom w:type="dxa" w:w="60"/>
-              <w:right w:type="dxa" w:w="100"/>
-            </w:tcMar>
-          </w:tcPr>
-          <w:p>
-            <w:pPr>
-              <w:keepNext/>
-              <w:jc w:val="center"/>
-            </w:pPr>
-            <w:r>
-              <w:rPr>
-                <w:b w:val="false"/>
-                <w:bCs w:val="false"/>
-                <w:color w:val="000000"/>
-                <w:sz w:val="18"/>
-                <w:szCs w:val="18"/>
-              </w:rPr>
-              <w:t xml:space="preserve">21.7%</w:t>
-            </w:r>
-          </w:p>
-        </w:tc>
-      </w:tr>
-      <w:tr>
-        <w:trPr>
-          <w:cantSplit/>
-          <w:tblHeader w:val="false"/>
-        </w:trPr>
-        <w:tc>
-          <w:tcPr>
-            <w:tcW w:type="dxa" w:w="2760"/>
-            <w:shd w:fill="EEF3F9" w:color="auto" w:val="clear"/>
-            <w:tcMar>
-              <w:top w:type="dxa" w:w="60"/>
-              <w:left w:type="dxa" w:w="100"/>
-              <w:bottom w:type="dxa" w:w="60"/>
-              <w:right w:type="dxa" w:w="100"/>
-            </w:tcMar>
-          </w:tcPr>
-          <w:p>
-            <w:pPr>
-              <w:keepNext w:val="false"/>
-              <w:jc w:val="left"/>
-            </w:pPr>
-            <w:r>
-              <w:rPr>
-                <w:b/>
-                <w:bCs/>
-                <w:color w:val="000000"/>
-                <w:sz w:val="18"/>
-                <w:szCs w:val="18"/>
-              </w:rPr>
-              <w:t xml:space="preserve">Alternativa 3</w:t>
-            </w:r>
-          </w:p>
-        </w:tc>
-        <w:tc>
-          <w:tcPr>
-            <w:tcW w:type="dxa" w:w="1300"/>
-            <w:shd w:fill="EEF3F9" w:color="auto" w:val="clear"/>
-            <w:tcMar>
-              <w:top w:type="dxa" w:w="60"/>
-              <w:left w:type="dxa" w:w="100"/>
-              <w:bottom w:type="dxa" w:w="60"/>
-              <w:right w:type="dxa" w:w="100"/>
-            </w:tcMar>
-          </w:tcPr>
-          <w:p>
-            <w:pPr>
-              <w:keepNext w:val="false"/>
-              <w:jc w:val="center"/>
-            </w:pPr>
-            <w:r>
-              <w:rPr>
-                <w:b w:val="false"/>
-                <w:bCs w:val="false"/>
-                <w:color w:val="000000"/>
-                <w:sz w:val="18"/>
-                <w:szCs w:val="18"/>
-              </w:rPr>
-              <w:t xml:space="preserve">394</w:t>
-            </w:r>
-          </w:p>
-        </w:tc>
-        <w:tc>
-          <w:tcPr>
-            <w:tcW w:type="dxa" w:w="2000"/>
-            <w:shd w:fill="EEF3F9" w:color="auto" w:val="clear"/>
-            <w:tcMar>
-              <w:top w:type="dxa" w:w="60"/>
-              <w:left w:type="dxa" w:w="100"/>
-              <w:bottom w:type="dxa" w:w="60"/>
-              <w:right w:type="dxa" w:w="100"/>
-            </w:tcMar>
-          </w:tcPr>
-          <w:p>
-            <w:pPr>
-              <w:keepNext w:val="false"/>
-              <w:jc w:val="center"/>
-            </w:pPr>
-            <w:r>
-              <w:rPr>
-                <w:b w:val="false"/>
-                <w:bCs w:val="false"/>
-                <w:color w:val="000000"/>
-                <w:sz w:val="18"/>
-                <w:szCs w:val="18"/>
-              </w:rPr>
-              <w:t xml:space="preserve">$109,257,865</w:t>
-            </w:r>
-          </w:p>
-        </w:tc>
-        <w:tc>
-          <w:tcPr>
-            <w:tcW w:type="dxa" w:w="2000"/>
-            <w:shd w:fill="EEF3F9" w:color="auto" w:val="clear"/>
-            <w:tcMar>
-              <w:top w:type="dxa" w:w="60"/>
-              <w:left w:type="dxa" w:w="100"/>
-              <w:bottom w:type="dxa" w:w="60"/>
-              <w:right w:type="dxa" w:w="100"/>
-            </w:tcMar>
-          </w:tcPr>
-          <w:p>
-            <w:pPr>
-              <w:keepNext w:val="false"/>
-              <w:jc w:val="center"/>
-            </w:pPr>
-            <w:r>
-              <w:rPr>
-                <w:b w:val="false"/>
-                <w:bCs w:val="false"/>
-                <w:color w:val="000000"/>
-                <w:sz w:val="18"/>
-                <w:szCs w:val="18"/>
-              </w:rPr>
-              <w:t xml:space="preserve">$31,242,589</w:t>
-            </w:r>
-          </w:p>
-        </w:tc>
-        <w:tc>
-          <w:tcPr>
-            <w:tcW w:type="dxa" w:w="1300"/>
-            <w:shd w:fill="EEF3F9" w:color="auto" w:val="clear"/>
             <w:tcMar>
               <w:top w:type="dxa" w:w="60"/>
               <w:left w:type="dxa" w:w="100"/>
@@ -3737,10 +3397,9 @@
         </w:tblBorders>
       </w:tblPr>
       <w:tblGrid>
-        <w:gridCol w:w="3360"/>
-        <w:gridCol w:w="2000"/>
-        <w:gridCol w:w="2000"/>
-        <w:gridCol w:w="2000"/>
+        <w:gridCol w:w="4160"/>
+        <w:gridCol w:w="2600"/>
+        <w:gridCol w:w="2600"/>
       </w:tblGrid>
       <w:tr>
         <w:trPr>
@@ -3749,7 +3408,7 @@
         </w:trPr>
         <w:tc>
           <w:tcPr>
-            <w:tcW w:type="dxa" w:w="3360"/>
+            <w:tcW w:type="dxa" w:w="4160"/>
             <w:shd w:fill="1B3A5C" w:color="auto" w:val="clear"/>
             <w:tcMar>
               <w:top w:type="dxa" w:w="60"/>
@@ -3777,7 +3436,7 @@
         </w:tc>
         <w:tc>
           <w:tcPr>
-            <w:tcW w:type="dxa" w:w="2000"/>
+            <w:tcW w:type="dxa" w:w="2600"/>
             <w:shd w:fill="1B3A5C" w:color="auto" w:val="clear"/>
             <w:tcMar>
               <w:top w:type="dxa" w:w="60"/>
@@ -3805,7 +3464,7 @@
         </w:tc>
         <w:tc>
           <w:tcPr>
-            <w:tcW w:type="dxa" w:w="2000"/>
+            <w:tcW w:type="dxa" w:w="2600"/>
             <w:shd w:fill="1B3A5C" w:color="auto" w:val="clear"/>
             <w:tcMar>
               <w:top w:type="dxa" w:w="60"/>
@@ -3828,34 +3487,6 @@
                 <w:szCs w:val="18"/>
               </w:rPr>
               <w:t xml:space="preserve">Alternativa 2</w:t>
-            </w:r>
-          </w:p>
-        </w:tc>
-        <w:tc>
-          <w:tcPr>
-            <w:tcW w:type="dxa" w:w="2000"/>
-            <w:shd w:fill="1B3A5C" w:color="auto" w:val="clear"/>
-            <w:tcMar>
-              <w:top w:type="dxa" w:w="60"/>
-              <w:left w:type="dxa" w:w="100"/>
-              <w:bottom w:type="dxa" w:w="60"/>
-              <w:right w:type="dxa" w:w="100"/>
-            </w:tcMar>
-          </w:tcPr>
-          <w:p>
-            <w:pPr>
-              <w:keepNext/>
-              <w:jc w:val="center"/>
-            </w:pPr>
-            <w:r>
-              <w:rPr>
-                <w:b/>
-                <w:bCs/>
-                <w:color w:val="FFFFFF"/>
-                <w:sz w:val="18"/>
-                <w:szCs w:val="18"/>
-              </w:rPr>
-              <w:t xml:space="preserve">Alternativa 3</w:t>
             </w:r>
           </w:p>
         </w:tc>
@@ -3867,7 +3498,7 @@
         </w:trPr>
         <w:tc>
           <w:tcPr>
-            <w:tcW w:type="dxa" w:w="3360"/>
+            <w:tcW w:type="dxa" w:w="4160"/>
             <w:tcMar>
               <w:top w:type="dxa" w:w="60"/>
               <w:left w:type="dxa" w:w="100"/>
@@ -3894,7 +3525,7 @@
         </w:tc>
         <w:tc>
           <w:tcPr>
-            <w:tcW w:type="dxa" w:w="2000"/>
+            <w:tcW w:type="dxa" w:w="2600"/>
             <w:tcMar>
               <w:top w:type="dxa" w:w="60"/>
               <w:left w:type="dxa" w:w="100"/>
@@ -3921,34 +3552,7 @@
         </w:tc>
         <w:tc>
           <w:tcPr>
-            <w:tcW w:type="dxa" w:w="2000"/>
-            <w:tcMar>
-              <w:top w:type="dxa" w:w="60"/>
-              <w:left w:type="dxa" w:w="100"/>
-              <w:bottom w:type="dxa" w:w="60"/>
-              <w:right w:type="dxa" w:w="100"/>
-            </w:tcMar>
-          </w:tcPr>
-          <w:p>
-            <w:pPr>
-              <w:keepNext/>
-              <w:jc w:val="center"/>
-            </w:pPr>
-            <w:r>
-              <w:rPr>
-                <w:b w:val="false"/>
-                <w:bCs w:val="false"/>
-                <w:color w:val="000000"/>
-                <w:sz w:val="18"/>
-                <w:szCs w:val="18"/>
-              </w:rPr>
-              <w:t xml:space="preserve">108</w:t>
-            </w:r>
-          </w:p>
-        </w:tc>
-        <w:tc>
-          <w:tcPr>
-            <w:tcW w:type="dxa" w:w="2000"/>
+            <w:tcW w:type="dxa" w:w="2600"/>
             <w:tcMar>
               <w:top w:type="dxa" w:w="60"/>
               <w:left w:type="dxa" w:w="100"/>
@@ -3981,7 +3585,7 @@
         </w:trPr>
         <w:tc>
           <w:tcPr>
-            <w:tcW w:type="dxa" w:w="3360"/>
+            <w:tcW w:type="dxa" w:w="4160"/>
             <w:shd w:fill="EEF3F9" w:color="auto" w:val="clear"/>
             <w:tcMar>
               <w:top w:type="dxa" w:w="60"/>
@@ -4009,7 +3613,7 @@
         </w:tc>
         <w:tc>
           <w:tcPr>
-            <w:tcW w:type="dxa" w:w="2000"/>
+            <w:tcW w:type="dxa" w:w="2600"/>
             <w:shd w:fill="EEF3F9" w:color="auto" w:val="clear"/>
             <w:tcMar>
               <w:top w:type="dxa" w:w="60"/>
@@ -4037,35 +3641,7 @@
         </w:tc>
         <w:tc>
           <w:tcPr>
-            <w:tcW w:type="dxa" w:w="2000"/>
-            <w:shd w:fill="EEF3F9" w:color="auto" w:val="clear"/>
-            <w:tcMar>
-              <w:top w:type="dxa" w:w="60"/>
-              <w:left w:type="dxa" w:w="100"/>
-              <w:bottom w:type="dxa" w:w="60"/>
-              <w:right w:type="dxa" w:w="100"/>
-            </w:tcMar>
-          </w:tcPr>
-          <w:p>
-            <w:pPr>
-              <w:keepNext/>
-              <w:jc w:val="center"/>
-            </w:pPr>
-            <w:r>
-              <w:rPr>
-                <w:b w:val="false"/>
-                <w:bCs w:val="false"/>
-                <w:color w:val="000000"/>
-                <w:sz w:val="18"/>
-                <w:szCs w:val="18"/>
-              </w:rPr>
-              <w:t xml:space="preserve">61</w:t>
-            </w:r>
-          </w:p>
-        </w:tc>
-        <w:tc>
-          <w:tcPr>
-            <w:tcW w:type="dxa" w:w="2000"/>
+            <w:tcW w:type="dxa" w:w="2600"/>
             <w:shd w:fill="EEF3F9" w:color="auto" w:val="clear"/>
             <w:tcMar>
               <w:top w:type="dxa" w:w="60"/>
@@ -4099,7 +3675,7 @@
         </w:trPr>
         <w:tc>
           <w:tcPr>
-            <w:tcW w:type="dxa" w:w="3360"/>
+            <w:tcW w:type="dxa" w:w="4160"/>
             <w:tcMar>
               <w:top w:type="dxa" w:w="60"/>
               <w:left w:type="dxa" w:w="100"/>
@@ -4126,7 +3702,7 @@
         </w:tc>
         <w:tc>
           <w:tcPr>
-            <w:tcW w:type="dxa" w:w="2000"/>
+            <w:tcW w:type="dxa" w:w="2600"/>
             <w:tcMar>
               <w:top w:type="dxa" w:w="60"/>
               <w:left w:type="dxa" w:w="100"/>
@@ -4153,34 +3729,7 @@
         </w:tc>
         <w:tc>
           <w:tcPr>
-            <w:tcW w:type="dxa" w:w="2000"/>
-            <w:tcMar>
-              <w:top w:type="dxa" w:w="60"/>
-              <w:left w:type="dxa" w:w="100"/>
-              <w:bottom w:type="dxa" w:w="60"/>
-              <w:right w:type="dxa" w:w="100"/>
-            </w:tcMar>
-          </w:tcPr>
-          <w:p>
-            <w:pPr>
-              <w:keepNext/>
-              <w:jc w:val="center"/>
-            </w:pPr>
-            <w:r>
-              <w:rPr>
-                <w:b w:val="false"/>
-                <w:bCs w:val="false"/>
-                <w:color w:val="000000"/>
-                <w:sz w:val="18"/>
-                <w:szCs w:val="18"/>
-              </w:rPr>
-              <w:t xml:space="preserve">47</w:t>
-            </w:r>
-          </w:p>
-        </w:tc>
-        <w:tc>
-          <w:tcPr>
-            <w:tcW w:type="dxa" w:w="2000"/>
+            <w:tcW w:type="dxa" w:w="2600"/>
             <w:tcMar>
               <w:top w:type="dxa" w:w="60"/>
               <w:left w:type="dxa" w:w="100"/>
@@ -4213,7 +3762,7 @@
         </w:trPr>
         <w:tc>
           <w:tcPr>
-            <w:tcW w:type="dxa" w:w="3360"/>
+            <w:tcW w:type="dxa" w:w="4160"/>
             <w:shd w:fill="EEF3F9" w:color="auto" w:val="clear"/>
             <w:tcMar>
               <w:top w:type="dxa" w:w="60"/>
@@ -4241,7 +3790,7 @@
         </w:tc>
         <w:tc>
           <w:tcPr>
-            <w:tcW w:type="dxa" w:w="2000"/>
+            <w:tcW w:type="dxa" w:w="2600"/>
             <w:shd w:fill="EEF3F9" w:color="auto" w:val="clear"/>
             <w:tcMar>
               <w:top w:type="dxa" w:w="60"/>
@@ -4269,35 +3818,7 @@
         </w:tc>
         <w:tc>
           <w:tcPr>
-            <w:tcW w:type="dxa" w:w="2000"/>
-            <w:shd w:fill="EEF3F9" w:color="auto" w:val="clear"/>
-            <w:tcMar>
-              <w:top w:type="dxa" w:w="60"/>
-              <w:left w:type="dxa" w:w="100"/>
-              <w:bottom w:type="dxa" w:w="60"/>
-              <w:right w:type="dxa" w:w="100"/>
-            </w:tcMar>
-          </w:tcPr>
-          <w:p>
-            <w:pPr>
-              <w:keepNext/>
-              <w:jc w:val="center"/>
-            </w:pPr>
-            <w:r>
-              <w:rPr>
-                <w:b w:val="false"/>
-                <w:bCs w:val="false"/>
-                <w:color w:val="000000"/>
-                <w:sz w:val="18"/>
-                <w:szCs w:val="18"/>
-              </w:rPr>
-              <w:t xml:space="preserve">74</w:t>
-            </w:r>
-          </w:p>
-        </w:tc>
-        <w:tc>
-          <w:tcPr>
-            <w:tcW w:type="dxa" w:w="2000"/>
+            <w:tcW w:type="dxa" w:w="2600"/>
             <w:shd w:fill="EEF3F9" w:color="auto" w:val="clear"/>
             <w:tcMar>
               <w:top w:type="dxa" w:w="60"/>
@@ -4331,7 +3852,7 @@
         </w:trPr>
         <w:tc>
           <w:tcPr>
-            <w:tcW w:type="dxa" w:w="3360"/>
+            <w:tcW w:type="dxa" w:w="4160"/>
             <w:tcMar>
               <w:top w:type="dxa" w:w="60"/>
               <w:left w:type="dxa" w:w="100"/>
@@ -4358,7 +3879,7 @@
         </w:tc>
         <w:tc>
           <w:tcPr>
-            <w:tcW w:type="dxa" w:w="2000"/>
+            <w:tcW w:type="dxa" w:w="2600"/>
             <w:tcMar>
               <w:top w:type="dxa" w:w="60"/>
               <w:left w:type="dxa" w:w="100"/>
@@ -4385,34 +3906,7 @@
         </w:tc>
         <w:tc>
           <w:tcPr>
-            <w:tcW w:type="dxa" w:w="2000"/>
-            <w:tcMar>
-              <w:top w:type="dxa" w:w="60"/>
-              <w:left w:type="dxa" w:w="100"/>
-              <w:bottom w:type="dxa" w:w="60"/>
-              <w:right w:type="dxa" w:w="100"/>
-            </w:tcMar>
-          </w:tcPr>
-          <w:p>
-            <w:pPr>
-              <w:keepNext/>
-              <w:jc w:val="center"/>
-            </w:pPr>
-            <w:r>
-              <w:rPr>
-                <w:b w:val="false"/>
-                <w:bCs w:val="false"/>
-                <w:color w:val="000000"/>
-                <w:sz w:val="18"/>
-                <w:szCs w:val="18"/>
-              </w:rPr>
-              <w:t xml:space="preserve">34</w:t>
-            </w:r>
-          </w:p>
-        </w:tc>
-        <w:tc>
-          <w:tcPr>
-            <w:tcW w:type="dxa" w:w="2000"/>
+            <w:tcW w:type="dxa" w:w="2600"/>
             <w:tcMar>
               <w:top w:type="dxa" w:w="60"/>
               <w:left w:type="dxa" w:w="100"/>
@@ -4445,7 +3939,7 @@
         </w:trPr>
         <w:tc>
           <w:tcPr>
-            <w:tcW w:type="dxa" w:w="3360"/>
+            <w:tcW w:type="dxa" w:w="4160"/>
             <w:shd w:fill="EEF3F9" w:color="auto" w:val="clear"/>
             <w:tcMar>
               <w:top w:type="dxa" w:w="60"/>
@@ -4473,7 +3967,7 @@
         </w:tc>
         <w:tc>
           <w:tcPr>
-            <w:tcW w:type="dxa" w:w="2000"/>
+            <w:tcW w:type="dxa" w:w="2600"/>
             <w:shd w:fill="EEF3F9" w:color="auto" w:val="clear"/>
             <w:tcMar>
               <w:top w:type="dxa" w:w="60"/>
@@ -4501,35 +3995,7 @@
         </w:tc>
         <w:tc>
           <w:tcPr>
-            <w:tcW w:type="dxa" w:w="2000"/>
-            <w:shd w:fill="EEF3F9" w:color="auto" w:val="clear"/>
-            <w:tcMar>
-              <w:top w:type="dxa" w:w="60"/>
-              <w:left w:type="dxa" w:w="100"/>
-              <w:bottom w:type="dxa" w:w="60"/>
-              <w:right w:type="dxa" w:w="100"/>
-            </w:tcMar>
-          </w:tcPr>
-          <w:p>
-            <w:pPr>
-              <w:keepNext/>
-              <w:jc w:val="center"/>
-            </w:pPr>
-            <w:r>
-              <w:rPr>
-                <w:b w:val="false"/>
-                <w:bCs w:val="false"/>
-                <w:color w:val="000000"/>
-                <w:sz w:val="18"/>
-                <w:szCs w:val="18"/>
-              </w:rPr>
-              <w:t xml:space="preserve">$17,562,589</w:t>
-            </w:r>
-          </w:p>
-        </w:tc>
-        <w:tc>
-          <w:tcPr>
-            <w:tcW w:type="dxa" w:w="2000"/>
+            <w:tcW w:type="dxa" w:w="2600"/>
             <w:shd w:fill="EEF3F9" w:color="auto" w:val="clear"/>
             <w:tcMar>
               <w:top w:type="dxa" w:w="60"/>
@@ -4563,7 +4029,7 @@
         </w:trPr>
         <w:tc>
           <w:tcPr>
-            <w:tcW w:type="dxa" w:w="3360"/>
+            <w:tcW w:type="dxa" w:w="4160"/>
             <w:tcMar>
               <w:top w:type="dxa" w:w="60"/>
               <w:left w:type="dxa" w:w="100"/>
@@ -4590,7 +4056,7 @@
         </w:tc>
         <w:tc>
           <w:tcPr>
-            <w:tcW w:type="dxa" w:w="2000"/>
+            <w:tcW w:type="dxa" w:w="2600"/>
             <w:tcMar>
               <w:top w:type="dxa" w:w="60"/>
               <w:left w:type="dxa" w:w="100"/>
@@ -4617,34 +4083,7 @@
         </w:tc>
         <w:tc>
           <w:tcPr>
-            <w:tcW w:type="dxa" w:w="2000"/>
-            <w:tcMar>
-              <w:top w:type="dxa" w:w="60"/>
-              <w:left w:type="dxa" w:w="100"/>
-              <w:bottom w:type="dxa" w:w="60"/>
-              <w:right w:type="dxa" w:w="100"/>
-            </w:tcMar>
-          </w:tcPr>
-          <w:p>
-            <w:pPr>
-              <w:keepNext/>
-              <w:jc w:val="center"/>
-            </w:pPr>
-            <w:r>
-              <w:rPr>
-                <w:b w:val="false"/>
-                <w:bCs w:val="false"/>
-                <w:color w:val="000000"/>
-                <w:sz w:val="18"/>
-                <w:szCs w:val="18"/>
-              </w:rPr>
-              <w:t xml:space="preserve">$12,859,200</w:t>
-            </w:r>
-          </w:p>
-        </w:tc>
-        <w:tc>
-          <w:tcPr>
-            <w:tcW w:type="dxa" w:w="2000"/>
+            <w:tcW w:type="dxa" w:w="2600"/>
             <w:tcMar>
               <w:top w:type="dxa" w:w="60"/>
               <w:left w:type="dxa" w:w="100"/>
@@ -4677,7 +4116,7 @@
         </w:trPr>
         <w:tc>
           <w:tcPr>
-            <w:tcW w:type="dxa" w:w="3360"/>
+            <w:tcW w:type="dxa" w:w="4160"/>
             <w:shd w:fill="EEF3F9" w:color="auto" w:val="clear"/>
             <w:tcMar>
               <w:top w:type="dxa" w:w="60"/>
@@ -4705,7 +4144,7 @@
         </w:tc>
         <w:tc>
           <w:tcPr>
-            <w:tcW w:type="dxa" w:w="2000"/>
+            <w:tcW w:type="dxa" w:w="2600"/>
             <w:shd w:fill="EEF3F9" w:color="auto" w:val="clear"/>
             <w:tcMar>
               <w:top w:type="dxa" w:w="60"/>
@@ -4733,35 +4172,7 @@
         </w:tc>
         <w:tc>
           <w:tcPr>
-            <w:tcW w:type="dxa" w:w="2000"/>
-            <w:shd w:fill="EEF3F9" w:color="auto" w:val="clear"/>
-            <w:tcMar>
-              <w:top w:type="dxa" w:w="60"/>
-              <w:left w:type="dxa" w:w="100"/>
-              <w:bottom w:type="dxa" w:w="60"/>
-              <w:right w:type="dxa" w:w="100"/>
-            </w:tcMar>
-          </w:tcPr>
-          <w:p>
-            <w:pPr>
-              <w:keepNext w:val="false"/>
-              <w:jc w:val="center"/>
-            </w:pPr>
-            <w:r>
-              <w:rPr>
-                <w:b w:val="false"/>
-                <w:bCs w:val="false"/>
-                <w:color w:val="000000"/>
-                <w:sz w:val="18"/>
-                <w:szCs w:val="18"/>
-              </w:rPr>
-              <w:t xml:space="preserve">79</w:t>
-            </w:r>
-          </w:p>
-        </w:tc>
-        <w:tc>
-          <w:tcPr>
-            <w:tcW w:type="dxa" w:w="2000"/>
+            <w:tcW w:type="dxa" w:w="2600"/>
             <w:shd w:fill="EEF3F9" w:color="auto" w:val="clear"/>
             <w:tcMar>
               <w:top w:type="dxa" w:w="60"/>
@@ -4799,7 +4210,7 @@
         <w:spacing w:after="140"/>
       </w:pPr>
       <w:r>
-        <w:t xml:space="preserve">Las tres alternativas retiran los mismos 61 guardias en farmacias foráneas, por $17.6 millones. La diferencia está en la CDMX, donde todos los guardias que se retiran son de HT SICHERHEIT.</w:t>
+        <w:t xml:space="preserve">Las dos alternativas retiran los mismos 61 guardias en farmacias foráneas, por $17.6 millones. La diferencia está en la CDMX, donde todos los guardias que se retiran son de HT SICHERHEIT.</w:t>
       </w:r>
     </w:p>
     <w:p>
@@ -4831,10 +4242,9 @@
         </w:tblBorders>
       </w:tblPr>
       <w:tblGrid>
-        <w:gridCol w:w="4560"/>
-        <w:gridCol w:w="1600"/>
-        <w:gridCol w:w="1600"/>
-        <w:gridCol w:w="1600"/>
+        <w:gridCol w:w="5160"/>
+        <w:gridCol w:w="2100"/>
+        <w:gridCol w:w="2100"/>
       </w:tblGrid>
       <w:tr>
         <w:trPr>
@@ -4843,7 +4253,7 @@
         </w:trPr>
         <w:tc>
           <w:tcPr>
-            <w:tcW w:type="dxa" w:w="4560"/>
+            <w:tcW w:type="dxa" w:w="5160"/>
             <w:shd w:fill="1B3A5C" w:color="auto" w:val="clear"/>
             <w:tcMar>
               <w:top w:type="dxa" w:w="60"/>
@@ -4871,7 +4281,7 @@
         </w:tc>
         <w:tc>
           <w:tcPr>
-            <w:tcW w:type="dxa" w:w="1600"/>
+            <w:tcW w:type="dxa" w:w="2100"/>
             <w:shd w:fill="1B3A5C" w:color="auto" w:val="clear"/>
             <w:tcMar>
               <w:top w:type="dxa" w:w="60"/>
@@ -4899,7 +4309,7 @@
         </w:tc>
         <w:tc>
           <w:tcPr>
-            <w:tcW w:type="dxa" w:w="1600"/>
+            <w:tcW w:type="dxa" w:w="2100"/>
             <w:shd w:fill="1B3A5C" w:color="auto" w:val="clear"/>
             <w:tcMar>
               <w:top w:type="dxa" w:w="60"/>
@@ -4922,34 +4332,6 @@
                 <w:szCs w:val="18"/>
               </w:rPr>
               <w:t xml:space="preserve">Alternativa 2</w:t>
-            </w:r>
-          </w:p>
-        </w:tc>
-        <w:tc>
-          <w:tcPr>
-            <w:tcW w:type="dxa" w:w="1600"/>
-            <w:shd w:fill="1B3A5C" w:color="auto" w:val="clear"/>
-            <w:tcMar>
-              <w:top w:type="dxa" w:w="60"/>
-              <w:left w:type="dxa" w:w="100"/>
-              <w:bottom w:type="dxa" w:w="60"/>
-              <w:right w:type="dxa" w:w="100"/>
-            </w:tcMar>
-          </w:tcPr>
-          <w:p>
-            <w:pPr>
-              <w:keepNext/>
-              <w:jc w:val="center"/>
-            </w:pPr>
-            <w:r>
-              <w:rPr>
-                <w:b/>
-                <w:bCs/>
-                <w:color w:val="FFFFFF"/>
-                <w:sz w:val="18"/>
-                <w:szCs w:val="18"/>
-              </w:rPr>
-              <w:t xml:space="preserve">Alternativa 3</w:t>
             </w:r>
           </w:p>
         </w:tc>
@@ -4961,7 +4343,7 @@
         </w:trPr>
         <w:tc>
           <w:tcPr>
-            <w:tcW w:type="dxa" w:w="4560"/>
+            <w:tcW w:type="dxa" w:w="5160"/>
             <w:tcMar>
               <w:top w:type="dxa" w:w="60"/>
               <w:left w:type="dxa" w:w="100"/>
@@ -4988,7 +4370,7 @@
         </w:tc>
         <w:tc>
           <w:tcPr>
-            <w:tcW w:type="dxa" w:w="1600"/>
+            <w:tcW w:type="dxa" w:w="2100"/>
             <w:tcMar>
               <w:top w:type="dxa" w:w="60"/>
               <w:left w:type="dxa" w:w="100"/>
@@ -5015,34 +4397,7 @@
         </w:tc>
         <w:tc>
           <w:tcPr>
-            <w:tcW w:type="dxa" w:w="1600"/>
-            <w:tcMar>
-              <w:top w:type="dxa" w:w="60"/>
-              <w:left w:type="dxa" w:w="100"/>
-              <w:bottom w:type="dxa" w:w="60"/>
-              <w:right w:type="dxa" w:w="100"/>
-            </w:tcMar>
-          </w:tcPr>
-          <w:p>
-            <w:pPr>
-              <w:keepNext/>
-              <w:jc w:val="center"/>
-            </w:pPr>
-            <w:r>
-              <w:rPr>
-                <w:b w:val="false"/>
-                <w:bCs w:val="false"/>
-                <w:color w:val="000000"/>
-                <w:sz w:val="18"/>
-                <w:szCs w:val="18"/>
-              </w:rPr>
-              <w:t xml:space="preserve">108</w:t>
-            </w:r>
-          </w:p>
-        </w:tc>
-        <w:tc>
-          <w:tcPr>
-            <w:tcW w:type="dxa" w:w="1600"/>
+            <w:tcW w:type="dxa" w:w="2100"/>
             <w:tcMar>
               <w:top w:type="dxa" w:w="60"/>
               <w:left w:type="dxa" w:w="100"/>
@@ -5075,7 +4430,7 @@
         </w:trPr>
         <w:tc>
           <w:tcPr>
-            <w:tcW w:type="dxa" w:w="4560"/>
+            <w:tcW w:type="dxa" w:w="5160"/>
             <w:shd w:fill="EEF3F9" w:color="auto" w:val="clear"/>
             <w:tcMar>
               <w:top w:type="dxa" w:w="60"/>
@@ -5103,7 +4458,7 @@
         </w:tc>
         <w:tc>
           <w:tcPr>
-            <w:tcW w:type="dxa" w:w="1600"/>
+            <w:tcW w:type="dxa" w:w="2100"/>
             <w:shd w:fill="EEF3F9" w:color="auto" w:val="clear"/>
             <w:tcMar>
               <w:top w:type="dxa" w:w="60"/>
@@ -5131,35 +4486,7 @@
         </w:tc>
         <w:tc>
           <w:tcPr>
-            <w:tcW w:type="dxa" w:w="1600"/>
-            <w:shd w:fill="EEF3F9" w:color="auto" w:val="clear"/>
-            <w:tcMar>
-              <w:top w:type="dxa" w:w="60"/>
-              <w:left w:type="dxa" w:w="100"/>
-              <w:bottom w:type="dxa" w:w="60"/>
-              <w:right w:type="dxa" w:w="100"/>
-            </w:tcMar>
-          </w:tcPr>
-          <w:p>
-            <w:pPr>
-              <w:keepNext/>
-              <w:jc w:val="center"/>
-            </w:pPr>
-            <w:r>
-              <w:rPr>
-                <w:b w:val="false"/>
-                <w:bCs w:val="false"/>
-                <w:color w:val="000000"/>
-                <w:sz w:val="18"/>
-                <w:szCs w:val="18"/>
-              </w:rPr>
-              <w:t xml:space="preserve">28</w:t>
-            </w:r>
-          </w:p>
-        </w:tc>
-        <w:tc>
-          <w:tcPr>
-            <w:tcW w:type="dxa" w:w="1600"/>
+            <w:tcW w:type="dxa" w:w="2100"/>
             <w:shd w:fill="EEF3F9" w:color="auto" w:val="clear"/>
             <w:tcMar>
               <w:top w:type="dxa" w:w="60"/>
@@ -5193,7 +4520,7 @@
         </w:trPr>
         <w:tc>
           <w:tcPr>
-            <w:tcW w:type="dxa" w:w="4560"/>
+            <w:tcW w:type="dxa" w:w="5160"/>
             <w:tcMar>
               <w:top w:type="dxa" w:w="60"/>
               <w:left w:type="dxa" w:w="100"/>
@@ -5220,7 +4547,7 @@
         </w:tc>
         <w:tc>
           <w:tcPr>
-            <w:tcW w:type="dxa" w:w="1600"/>
+            <w:tcW w:type="dxa" w:w="2100"/>
             <w:tcMar>
               <w:top w:type="dxa" w:w="60"/>
               <w:left w:type="dxa" w:w="100"/>
@@ -5247,34 +4574,7 @@
         </w:tc>
         <w:tc>
           <w:tcPr>
-            <w:tcW w:type="dxa" w:w="1600"/>
-            <w:tcMar>
-              <w:top w:type="dxa" w:w="60"/>
-              <w:left w:type="dxa" w:w="100"/>
-              <w:bottom w:type="dxa" w:w="60"/>
-              <w:right w:type="dxa" w:w="100"/>
-            </w:tcMar>
-          </w:tcPr>
-          <w:p>
-            <w:pPr>
-              <w:keepNext/>
-              <w:jc w:val="center"/>
-            </w:pPr>
-            <w:r>
-              <w:rPr>
-                <w:b w:val="false"/>
-                <w:bCs w:val="false"/>
-                <w:color w:val="000000"/>
-                <w:sz w:val="18"/>
-                <w:szCs w:val="18"/>
-              </w:rPr>
-              <w:t xml:space="preserve">$470,181</w:t>
-            </w:r>
-          </w:p>
-        </w:tc>
-        <w:tc>
-          <w:tcPr>
-            <w:tcW w:type="dxa" w:w="1600"/>
+            <w:tcW w:type="dxa" w:w="2100"/>
             <w:tcMar>
               <w:top w:type="dxa" w:w="60"/>
               <w:left w:type="dxa" w:w="100"/>
@@ -5307,7 +4607,7 @@
         </w:trPr>
         <w:tc>
           <w:tcPr>
-            <w:tcW w:type="dxa" w:w="4560"/>
+            <w:tcW w:type="dxa" w:w="5160"/>
             <w:shd w:fill="EEF3F9" w:color="auto" w:val="clear"/>
             <w:tcMar>
               <w:top w:type="dxa" w:w="60"/>
@@ -5335,7 +4635,7 @@
         </w:tc>
         <w:tc>
           <w:tcPr>
-            <w:tcW w:type="dxa" w:w="1600"/>
+            <w:tcW w:type="dxa" w:w="2100"/>
             <w:shd w:fill="EEF3F9" w:color="auto" w:val="clear"/>
             <w:tcMar>
               <w:top w:type="dxa" w:w="60"/>
@@ -5363,35 +4663,7 @@
         </w:tc>
         <w:tc>
           <w:tcPr>
-            <w:tcW w:type="dxa" w:w="1600"/>
-            <w:shd w:fill="EEF3F9" w:color="auto" w:val="clear"/>
-            <w:tcMar>
-              <w:top w:type="dxa" w:w="60"/>
-              <w:left w:type="dxa" w:w="100"/>
-              <w:bottom w:type="dxa" w:w="60"/>
-              <w:right w:type="dxa" w:w="100"/>
-            </w:tcMar>
-          </w:tcPr>
-          <w:p>
-            <w:pPr>
-              <w:keepNext/>
-              <w:jc w:val="center"/>
-            </w:pPr>
-            <w:r>
-              <w:rPr>
-                <w:b w:val="false"/>
-                <w:bCs w:val="false"/>
-                <w:color w:val="000000"/>
-                <w:sz w:val="18"/>
-                <w:szCs w:val="18"/>
-              </w:rPr>
-              <w:t xml:space="preserve">27%</w:t>
-            </w:r>
-          </w:p>
-        </w:tc>
-        <w:tc>
-          <w:tcPr>
-            <w:tcW w:type="dxa" w:w="1600"/>
+            <w:tcW w:type="dxa" w:w="2100"/>
             <w:shd w:fill="EEF3F9" w:color="auto" w:val="clear"/>
             <w:tcMar>
               <w:top w:type="dxa" w:w="60"/>
@@ -5425,7 +4697,7 @@
         </w:trPr>
         <w:tc>
           <w:tcPr>
-            <w:tcW w:type="dxa" w:w="4560"/>
+            <w:tcW w:type="dxa" w:w="5160"/>
             <w:tcMar>
               <w:top w:type="dxa" w:w="60"/>
               <w:left w:type="dxa" w:w="100"/>
@@ -5452,7 +4724,7 @@
         </w:tc>
         <w:tc>
           <w:tcPr>
-            <w:tcW w:type="dxa" w:w="1600"/>
+            <w:tcW w:type="dxa" w:w="2100"/>
             <w:tcMar>
               <w:top w:type="dxa" w:w="60"/>
               <w:left w:type="dxa" w:w="100"/>
@@ -5479,34 +4751,7 @@
         </w:tc>
         <w:tc>
           <w:tcPr>
-            <w:tcW w:type="dxa" w:w="1600"/>
-            <w:tcMar>
-              <w:top w:type="dxa" w:w="60"/>
-              <w:left w:type="dxa" w:w="100"/>
-              <w:bottom w:type="dxa" w:w="60"/>
-              <w:right w:type="dxa" w:w="100"/>
-            </w:tcMar>
-          </w:tcPr>
-          <w:p>
-            <w:pPr>
-              <w:keepNext/>
-              <w:jc w:val="center"/>
-            </w:pPr>
-            <w:r>
-              <w:rPr>
-                <w:b w:val="false"/>
-                <w:bCs w:val="false"/>
-                <w:color w:val="000000"/>
-                <w:sz w:val="18"/>
-                <w:szCs w:val="18"/>
-              </w:rPr>
-              <w:t xml:space="preserve">27</w:t>
-            </w:r>
-          </w:p>
-        </w:tc>
-        <w:tc>
-          <w:tcPr>
-            <w:tcW w:type="dxa" w:w="1600"/>
+            <w:tcW w:type="dxa" w:w="2100"/>
             <w:tcMar>
               <w:top w:type="dxa" w:w="60"/>
               <w:left w:type="dxa" w:w="100"/>
@@ -5539,7 +4784,7 @@
         </w:trPr>
         <w:tc>
           <w:tcPr>
-            <w:tcW w:type="dxa" w:w="4560"/>
+            <w:tcW w:type="dxa" w:w="5160"/>
             <w:shd w:fill="EEF3F9" w:color="auto" w:val="clear"/>
             <w:tcMar>
               <w:top w:type="dxa" w:w="60"/>
@@ -5567,7 +4812,7 @@
         </w:tc>
         <w:tc>
           <w:tcPr>
-            <w:tcW w:type="dxa" w:w="1600"/>
+            <w:tcW w:type="dxa" w:w="2100"/>
             <w:shd w:fill="EEF3F9" w:color="auto" w:val="clear"/>
             <w:tcMar>
               <w:top w:type="dxa" w:w="60"/>
@@ -5595,35 +4840,7 @@
         </w:tc>
         <w:tc>
           <w:tcPr>
-            <w:tcW w:type="dxa" w:w="1600"/>
-            <w:shd w:fill="EEF3F9" w:color="auto" w:val="clear"/>
-            <w:tcMar>
-              <w:top w:type="dxa" w:w="60"/>
-              <w:left w:type="dxa" w:w="100"/>
-              <w:bottom w:type="dxa" w:w="60"/>
-              <w:right w:type="dxa" w:w="100"/>
-            </w:tcMar>
-          </w:tcPr>
-          <w:p>
-            <w:pPr>
-              <w:keepNext/>
-              <w:jc w:val="center"/>
-            </w:pPr>
-            <w:r>
-              <w:rPr>
-                <w:b w:val="false"/>
-                <w:bCs w:val="false"/>
-                <w:color w:val="000000"/>
-                <w:sz w:val="18"/>
-                <w:szCs w:val="18"/>
-              </w:rPr>
-              <w:t xml:space="preserve">52</w:t>
-            </w:r>
-          </w:p>
-        </w:tc>
-        <w:tc>
-          <w:tcPr>
-            <w:tcW w:type="dxa" w:w="1600"/>
+            <w:tcW w:type="dxa" w:w="2100"/>
             <w:shd w:fill="EEF3F9" w:color="auto" w:val="clear"/>
             <w:tcMar>
               <w:top w:type="dxa" w:w="60"/>
@@ -5657,7 +4874,7 @@
         </w:trPr>
         <w:tc>
           <w:tcPr>
-            <w:tcW w:type="dxa" w:w="4560"/>
+            <w:tcW w:type="dxa" w:w="5160"/>
             <w:tcMar>
               <w:top w:type="dxa" w:w="60"/>
               <w:left w:type="dxa" w:w="100"/>
@@ -5684,7 +4901,7 @@
         </w:tc>
         <w:tc>
           <w:tcPr>
-            <w:tcW w:type="dxa" w:w="1600"/>
+            <w:tcW w:type="dxa" w:w="2100"/>
             <w:tcMar>
               <w:top w:type="dxa" w:w="60"/>
               <w:left w:type="dxa" w:w="100"/>
@@ -5711,34 +4928,7 @@
         </w:tc>
         <w:tc>
           <w:tcPr>
-            <w:tcW w:type="dxa" w:w="1600"/>
-            <w:tcMar>
-              <w:top w:type="dxa" w:w="60"/>
-              <w:left w:type="dxa" w:w="100"/>
-              <w:bottom w:type="dxa" w:w="60"/>
-              <w:right w:type="dxa" w:w="100"/>
-            </w:tcMar>
-          </w:tcPr>
-          <w:p>
-            <w:pPr>
-              <w:keepNext/>
-              <w:jc w:val="center"/>
-            </w:pPr>
-            <w:r>
-              <w:rPr>
-                <w:b w:val="false"/>
-                <w:bCs w:val="false"/>
-                <w:color w:val="000000"/>
-                <w:sz w:val="18"/>
-                <w:szCs w:val="18"/>
-              </w:rPr>
-              <w:t xml:space="preserve">25%</w:t>
-            </w:r>
-          </w:p>
-        </w:tc>
-        <w:tc>
-          <w:tcPr>
-            <w:tcW w:type="dxa" w:w="1600"/>
+            <w:tcW w:type="dxa" w:w="2100"/>
             <w:tcMar>
               <w:top w:type="dxa" w:w="60"/>
               <w:left w:type="dxa" w:w="100"/>
@@ -5771,7 +4961,7 @@
         </w:trPr>
         <w:tc>
           <w:tcPr>
-            <w:tcW w:type="dxa" w:w="4560"/>
+            <w:tcW w:type="dxa" w:w="5160"/>
             <w:shd w:fill="EEF3F9" w:color="auto" w:val="clear"/>
             <w:tcMar>
               <w:top w:type="dxa" w:w="60"/>
@@ -5799,7 +4989,7 @@
         </w:tc>
         <w:tc>
           <w:tcPr>
-            <w:tcW w:type="dxa" w:w="1600"/>
+            <w:tcW w:type="dxa" w:w="2100"/>
             <w:shd w:fill="EEF3F9" w:color="auto" w:val="clear"/>
             <w:tcMar>
               <w:top w:type="dxa" w:w="60"/>
@@ -5827,35 +5017,7 @@
         </w:tc>
         <w:tc>
           <w:tcPr>
-            <w:tcW w:type="dxa" w:w="1600"/>
-            <w:shd w:fill="EEF3F9" w:color="auto" w:val="clear"/>
-            <w:tcMar>
-              <w:top w:type="dxa" w:w="60"/>
-              <w:left w:type="dxa" w:w="100"/>
-              <w:bottom w:type="dxa" w:w="60"/>
-              <w:right w:type="dxa" w:w="100"/>
-            </w:tcMar>
-          </w:tcPr>
-          <w:p>
-            <w:pPr>
-              <w:keepNext w:val="false"/>
-              <w:jc w:val="center"/>
-            </w:pPr>
-            <w:r>
-              <w:rPr>
-                <w:b w:val="false"/>
-                <w:bCs w:val="false"/>
-                <w:color w:val="000000"/>
-                <w:sz w:val="18"/>
-                <w:szCs w:val="18"/>
-              </w:rPr>
-              <w:t xml:space="preserve">$17,669,642</w:t>
-            </w:r>
-          </w:p>
-        </w:tc>
-        <w:tc>
-          <w:tcPr>
-            <w:tcW w:type="dxa" w:w="1600"/>
+            <w:tcW w:type="dxa" w:w="2100"/>
             <w:shd w:fill="EEF3F9" w:color="auto" w:val="clear"/>
             <w:tcMar>
               <w:top w:type="dxa" w:w="60"/>
@@ -5901,7 +5063,7 @@
         <w:spacing w:after="140"/>
       </w:pPr>
       <w:r>
-        <w:t xml:space="preserve">Las alternativas 2 y 3 retiran el guardia en farmacias de la CDMX con más robo a esa hora. Las 37 farmacias que la alternativa 3 agrega respecto a la alternativa 1 registraron 45 robos nocturnos de enero de 2025 a septiembre de 2026, por $535,273, y 42 de ellos ocurrieron entre las 22:00 y las 22:59. El ahorro del periodo equivale a 38 veces el monto robado en la alternativa 2 y a 35 veces en la alternativa 3.</w:t>
+        <w:t xml:space="preserve">La alternativa 2 retira además el guardia en 37 farmacias de la CDMX con más robo a esa hora. Esas farmacias registraron 45 robos nocturnos de enero de 2025 a septiembre de 2026, por $535,273, y 42 de ellos ocurrieron entre las 22:00 y las 22:59. Con la alternativa 2, el 33% del robo nocturno de la red queda en farmacias sin guardia nocturno y el ahorro del periodo equivale a 35 veces el monto robado.</w:t>
       </w:r>
     </w:p>
     <w:p>
@@ -5917,7 +5079,7 @@
         <w:pStyle w:val="Heading2"/>
       </w:pPr>
       <w:r>
-        <w:t xml:space="preserve">4.3 Sensibilidad de las alternativas 2 y 3</w:t>
+        <w:t xml:space="preserve">4.3 Sensibilidad de la alternativa 2</w:t>
       </w:r>
     </w:p>
     <w:p>
@@ -5926,7 +5088,7 @@
         <w:spacing w:after="140"/>
       </w:pPr>
       <w:r>
-        <w:t xml:space="preserve">El ahorro de las alternativas 2 y 3 depende de dos umbrales que se aplican en la CDMX: los robos organizados nocturnos y los robos entre las 22:00 y las 22:59 para considerar robo alto.</w:t>
+        <w:t xml:space="preserve">El ahorro de la alternativa 2 depende de los umbrales que se aplican en la CDMX y del adelanto de ventanilla en las farmacias con robo alto a las 22:00.</w:t>
       </w:r>
     </w:p>
     <w:tbl>
@@ -5942,9 +5104,8 @@
         </w:tblBorders>
       </w:tblPr>
       <w:tblGrid>
-        <w:gridCol w:w="4560"/>
-        <w:gridCol w:w="2400"/>
-        <w:gridCol w:w="2400"/>
+        <w:gridCol w:w="6360"/>
+        <w:gridCol w:w="3000"/>
       </w:tblGrid>
       <w:tr>
         <w:trPr>
@@ -5953,7 +5114,7 @@
         </w:trPr>
         <w:tc>
           <w:tcPr>
-            <w:tcW w:type="dxa" w:w="4560"/>
+            <w:tcW w:type="dxa" w:w="6360"/>
             <w:shd w:fill="1B3A5C" w:color="auto" w:val="clear"/>
             <w:tcMar>
               <w:top w:type="dxa" w:w="60"/>
@@ -5975,13 +5136,13 @@
                 <w:sz w:val="18"/>
                 <w:szCs w:val="18"/>
               </w:rPr>
-              <w:t xml:space="preserve">Umbral</w:t>
-            </w:r>
-          </w:p>
-        </w:tc>
-        <w:tc>
-          <w:tcPr>
-            <w:tcW w:type="dxa" w:w="2400"/>
+              <w:t xml:space="preserve">Supuesto</w:t>
+            </w:r>
+          </w:p>
+        </w:tc>
+        <w:tc>
+          <w:tcPr>
+            <w:tcW w:type="dxa" w:w="3000"/>
             <w:shd w:fill="1B3A5C" w:color="auto" w:val="clear"/>
             <w:tcMar>
               <w:top w:type="dxa" w:w="60"/>
@@ -6003,35 +5164,7 @@
                 <w:sz w:val="18"/>
                 <w:szCs w:val="18"/>
               </w:rPr>
-              <w:t xml:space="preserve">Alternativa 2</w:t>
-            </w:r>
-          </w:p>
-        </w:tc>
-        <w:tc>
-          <w:tcPr>
-            <w:tcW w:type="dxa" w:w="2400"/>
-            <w:shd w:fill="1B3A5C" w:color="auto" w:val="clear"/>
-            <w:tcMar>
-              <w:top w:type="dxa" w:w="60"/>
-              <w:left w:type="dxa" w:w="100"/>
-              <w:bottom w:type="dxa" w:w="60"/>
-              <w:right w:type="dxa" w:w="100"/>
-            </w:tcMar>
-          </w:tcPr>
-          <w:p>
-            <w:pPr>
-              <w:keepNext/>
-              <w:jc w:val="center"/>
-            </w:pPr>
-            <w:r>
-              <w:rPr>
-                <w:b/>
-                <w:bCs/>
-                <w:color w:val="FFFFFF"/>
-                <w:sz w:val="18"/>
-                <w:szCs w:val="18"/>
-              </w:rPr>
-              <w:t xml:space="preserve">Alternativa 3</w:t>
+              <w:t xml:space="preserve">Ahorro anual</w:t>
             </w:r>
           </w:p>
         </w:tc>
@@ -6043,7 +5176,7 @@
         </w:trPr>
         <w:tc>
           <w:tcPr>
-            <w:tcW w:type="dxa" w:w="4560"/>
+            <w:tcW w:type="dxa" w:w="6360"/>
             <w:tcMar>
               <w:top w:type="dxa" w:w="60"/>
               <w:left w:type="dxa" w:w="100"/>
@@ -6064,40 +5197,13 @@
                 <w:sz w:val="18"/>
                 <w:szCs w:val="18"/>
               </w:rPr>
-              <w:t xml:space="preserve">Criterios de este reporte (3 y 3)</w:t>
-            </w:r>
-          </w:p>
-        </w:tc>
-        <w:tc>
-          <w:tcPr>
-            <w:tcW w:type="dxa" w:w="2400"/>
-            <w:tcMar>
-              <w:top w:type="dxa" w:w="60"/>
-              <w:left w:type="dxa" w:w="100"/>
-              <w:bottom w:type="dxa" w:w="60"/>
-              <w:right w:type="dxa" w:w="100"/>
-            </w:tcMar>
-          </w:tcPr>
-          <w:p>
-            <w:pPr>
-              <w:keepNext/>
-              <w:jc w:val="center"/>
-            </w:pPr>
-            <w:r>
-              <w:rPr>
-                <w:b w:val="false"/>
-                <w:bCs w:val="false"/>
-                <w:color w:val="000000"/>
-                <w:sz w:val="18"/>
-                <w:szCs w:val="18"/>
-              </w:rPr>
-              <w:t xml:space="preserve">$30,421,789</w:t>
-            </w:r>
-          </w:p>
-        </w:tc>
-        <w:tc>
-          <w:tcPr>
-            <w:tcW w:type="dxa" w:w="2400"/>
+              <w:t xml:space="preserve">Criterios de este reporte</w:t>
+            </w:r>
+          </w:p>
+        </w:tc>
+        <w:tc>
+          <w:tcPr>
+            <w:tcW w:type="dxa" w:w="3000"/>
             <w:tcMar>
               <w:top w:type="dxa" w:w="60"/>
               <w:left w:type="dxa" w:w="100"/>
@@ -6130,7 +5236,7 @@
         </w:trPr>
         <w:tc>
           <w:tcPr>
-            <w:tcW w:type="dxa" w:w="4560"/>
+            <w:tcW w:type="dxa" w:w="6360"/>
             <w:shd w:fill="EEF3F9" w:color="auto" w:val="clear"/>
             <w:tcMar>
               <w:top w:type="dxa" w:w="60"/>
@@ -6152,41 +5258,13 @@
                 <w:sz w:val="18"/>
                 <w:szCs w:val="18"/>
               </w:rPr>
-              <w:t xml:space="preserve">Robo organizado nocturno: 2 o más</w:t>
-            </w:r>
-          </w:p>
-        </w:tc>
-        <w:tc>
-          <w:tcPr>
-            <w:tcW w:type="dxa" w:w="2400"/>
-            <w:shd w:fill="EEF3F9" w:color="auto" w:val="clear"/>
-            <w:tcMar>
-              <w:top w:type="dxa" w:w="60"/>
-              <w:left w:type="dxa" w:w="100"/>
-              <w:bottom w:type="dxa" w:w="60"/>
-              <w:right w:type="dxa" w:w="100"/>
-            </w:tcMar>
-          </w:tcPr>
-          <w:p>
-            <w:pPr>
-              <w:keepNext/>
-              <w:jc w:val="center"/>
-            </w:pPr>
-            <w:r>
-              <w:rPr>
-                <w:b w:val="false"/>
-                <w:bCs w:val="false"/>
-                <w:color w:val="000000"/>
-                <w:sz w:val="18"/>
-                <w:szCs w:val="18"/>
-              </w:rPr>
-              <w:t xml:space="preserve">$27,959,389</w:t>
-            </w:r>
-          </w:p>
-        </w:tc>
-        <w:tc>
-          <w:tcPr>
-            <w:tcW w:type="dxa" w:w="2400"/>
+              <w:t xml:space="preserve">Robo organizado nocturno: 2 o más en vez de 3</w:t>
+            </w:r>
+          </w:p>
+        </w:tc>
+        <w:tc>
+          <w:tcPr>
+            <w:tcW w:type="dxa" w:w="3000"/>
             <w:shd w:fill="EEF3F9" w:color="auto" w:val="clear"/>
             <w:tcMar>
               <w:top w:type="dxa" w:w="60"/>
@@ -6220,7 +5298,7 @@
         </w:trPr>
         <w:tc>
           <w:tcPr>
-            <w:tcW w:type="dxa" w:w="4560"/>
+            <w:tcW w:type="dxa" w:w="6360"/>
             <w:tcMar>
               <w:top w:type="dxa" w:w="60"/>
               <w:left w:type="dxa" w:w="100"/>
@@ -6241,13 +5319,13 @@
                 <w:sz w:val="18"/>
                 <w:szCs w:val="18"/>
               </w:rPr>
-              <w:t xml:space="preserve">Robo alto a las 22:00: 2 o más</w:t>
-            </w:r>
-          </w:p>
-        </w:tc>
-        <w:tc>
-          <w:tcPr>
-            <w:tcW w:type="dxa" w:w="2400"/>
+              <w:t xml:space="preserve">Sin adelanto de ventanilla: las farmacias con robo alto a las 22:00 conservan el guardia</w:t>
+            </w:r>
+          </w:p>
+        </w:tc>
+        <w:tc>
+          <w:tcPr>
+            <w:tcW w:type="dxa" w:w="3000"/>
             <w:tcMar>
               <w:top w:type="dxa" w:w="60"/>
               <w:left w:type="dxa" w:w="100"/>
@@ -6268,34 +5346,7 @@
                 <w:sz w:val="18"/>
                 <w:szCs w:val="18"/>
               </w:rPr>
-              <w:t xml:space="preserve">$27,959,389</w:t>
-            </w:r>
-          </w:p>
-        </w:tc>
-        <w:tc>
-          <w:tcPr>
-            <w:tcW w:type="dxa" w:w="2400"/>
-            <w:tcMar>
-              <w:top w:type="dxa" w:w="60"/>
-              <w:left w:type="dxa" w:w="100"/>
-              <w:bottom w:type="dxa" w:w="60"/>
-              <w:right w:type="dxa" w:w="100"/>
-            </w:tcMar>
-          </w:tcPr>
-          <w:p>
-            <w:pPr>
-              <w:keepNext/>
-              <w:jc w:val="center"/>
-            </w:pPr>
-            <w:r>
-              <w:rPr>
-                <w:b w:val="false"/>
-                <w:bCs w:val="false"/>
-                <w:color w:val="000000"/>
-                <w:sz w:val="18"/>
-                <w:szCs w:val="18"/>
-              </w:rPr>
-              <w:t xml:space="preserve">$31,242,589</w:t>
+              <w:t xml:space="preserve">$30,421,789</w:t>
             </w:r>
           </w:p>
         </w:tc>
@@ -6307,18 +5358,18 @@
         </w:trPr>
         <w:tc>
           <w:tcPr>
-            <w:tcW w:type="dxa" w:w="4560"/>
-            <w:shd w:fill="EEF3F9" w:color="auto" w:val="clear"/>
-            <w:tcMar>
-              <w:top w:type="dxa" w:w="60"/>
-              <w:left w:type="dxa" w:w="100"/>
-              <w:bottom w:type="dxa" w:w="60"/>
-              <w:right w:type="dxa" w:w="100"/>
-            </w:tcMar>
-          </w:tcPr>
-          <w:p>
-            <w:pPr>
-              <w:keepNext w:val="false"/>
+            <w:tcW w:type="dxa" w:w="6360"/>
+            <w:shd w:fill="EEF3F9" w:color="auto" w:val="clear"/>
+            <w:tcMar>
+              <w:top w:type="dxa" w:w="60"/>
+              <w:left w:type="dxa" w:w="100"/>
+              <w:bottom w:type="dxa" w:w="60"/>
+              <w:right w:type="dxa" w:w="100"/>
+            </w:tcMar>
+          </w:tcPr>
+          <w:p>
+            <w:pPr>
+              <w:keepNext/>
               <w:jc w:val="left"/>
             </w:pPr>
             <w:r>
@@ -6329,14 +5380,74 @@
                 <w:sz w:val="18"/>
                 <w:szCs w:val="18"/>
               </w:rPr>
-              <w:t xml:space="preserve">Robo alto a las 22:00: 4 o más</w:t>
-            </w:r>
-          </w:p>
-        </w:tc>
-        <w:tc>
-          <w:tcPr>
-            <w:tcW w:type="dxa" w:w="2400"/>
-            <w:shd w:fill="EEF3F9" w:color="auto" w:val="clear"/>
+              <w:t xml:space="preserve">Sin adelanto de ventanilla y robo alto desde 2 robos</w:t>
+            </w:r>
+          </w:p>
+        </w:tc>
+        <w:tc>
+          <w:tcPr>
+            <w:tcW w:type="dxa" w:w="3000"/>
+            <w:shd w:fill="EEF3F9" w:color="auto" w:val="clear"/>
+            <w:tcMar>
+              <w:top w:type="dxa" w:w="60"/>
+              <w:left w:type="dxa" w:w="100"/>
+              <w:bottom w:type="dxa" w:w="60"/>
+              <w:right w:type="dxa" w:w="100"/>
+            </w:tcMar>
+          </w:tcPr>
+          <w:p>
+            <w:pPr>
+              <w:keepNext/>
+              <w:jc w:val="center"/>
+            </w:pPr>
+            <w:r>
+              <w:rPr>
+                <w:b w:val="false"/>
+                <w:bCs w:val="false"/>
+                <w:color w:val="000000"/>
+                <w:sz w:val="18"/>
+                <w:szCs w:val="18"/>
+              </w:rPr>
+              <w:t xml:space="preserve">$27,959,389</w:t>
+            </w:r>
+          </w:p>
+        </w:tc>
+      </w:tr>
+      <w:tr>
+        <w:trPr>
+          <w:cantSplit/>
+          <w:tblHeader w:val="false"/>
+        </w:trPr>
+        <w:tc>
+          <w:tcPr>
+            <w:tcW w:type="dxa" w:w="6360"/>
+            <w:tcMar>
+              <w:top w:type="dxa" w:w="60"/>
+              <w:left w:type="dxa" w:w="100"/>
+              <w:bottom w:type="dxa" w:w="60"/>
+              <w:right w:type="dxa" w:w="100"/>
+            </w:tcMar>
+          </w:tcPr>
+          <w:p>
+            <w:pPr>
+              <w:keepNext w:val="false"/>
+              <w:jc w:val="left"/>
+            </w:pPr>
+            <w:r>
+              <w:rPr>
+                <w:b/>
+                <w:bCs/>
+                <w:color w:val="000000"/>
+                <w:sz w:val="18"/>
+                <w:szCs w:val="18"/>
+              </w:rPr>
+              <w:t xml:space="preserve">Sin adelanto de ventanilla y robo alto desde 4 robos</w:t>
+            </w:r>
+          </w:p>
+        </w:tc>
+        <w:tc>
+          <w:tcPr>
+            <w:tcW w:type="dxa" w:w="3000"/>
             <w:tcMar>
               <w:top w:type="dxa" w:w="60"/>
               <w:left w:type="dxa" w:w="100"/>
@@ -6358,34 +5469,6 @@
                 <w:szCs w:val="18"/>
               </w:rPr>
               <w:t xml:space="preserve">$30,968,989</w:t>
-            </w:r>
-          </w:p>
-        </w:tc>
-        <w:tc>
-          <w:tcPr>
-            <w:tcW w:type="dxa" w:w="2400"/>
-            <w:shd w:fill="EEF3F9" w:color="auto" w:val="clear"/>
-            <w:tcMar>
-              <w:top w:type="dxa" w:w="60"/>
-              <w:left w:type="dxa" w:w="100"/>
-              <w:bottom w:type="dxa" w:w="60"/>
-              <w:right w:type="dxa" w:w="100"/>
-            </w:tcMar>
-          </w:tcPr>
-          <w:p>
-            <w:pPr>
-              <w:keepNext w:val="false"/>
-              <w:jc w:val="center"/>
-            </w:pPr>
-            <w:r>
-              <w:rPr>
-                <w:b w:val="false"/>
-                <w:bCs w:val="false"/>
-                <w:color w:val="000000"/>
-                <w:sz w:val="18"/>
-                <w:szCs w:val="18"/>
-              </w:rPr>
-              <w:t xml:space="preserve">$31,242,589</w:t>
             </w:r>
           </w:p>
         </w:tc>
@@ -6401,7 +5484,7 @@
         <w:spacing w:after="140"/>
       </w:pPr>
       <w:r>
-        <w:t xml:space="preserve">En la alternativa 3, el umbral de robo a las 22:00 no cambia el ahorro, solo el número de farmacias en las que se adelanta la ventanilla: 12 con 2 o más robos y 1 con 4 o más.</w:t>
+        <w:t xml:space="preserve">Con el adelanto de ventanilla, el umbral de robo a las 22:00 no cambia el ahorro, solo el número de farmacias en las que se adelanta: 12 con 2 o más robos, 3 con 3 o más y 1 con 4 o más.</w:t>
       </w:r>
     </w:p>
     <w:p>
@@ -6426,7 +5509,7 @@
         <w:spacing w:after="140"/>
       </w:pPr>
       <w:r>
-        <w:t xml:space="preserve">Las tres alternativas conservan los turnos matutino y vespertino, los 9 guardias armados y el turno nocturno de las 13 farmacias en revisión de horario. En las 100 farmacias foráneas aplican la misma regla y se diferencian en la CDMX.</w:t>
+        <w:t xml:space="preserve">Las dos alternativas conservan los turnos matutino y vespertino, los 9 guardias armados y el turno nocturno de las 13 farmacias en revisión de horario. En las 100 farmacias foráneas aplican la misma regla y se diferencian en la CDMX.</w:t>
       </w:r>
     </w:p>
     <w:tbl>
@@ -6697,7 +5780,7 @@
           </w:tcPr>
           <w:p>
             <w:pPr>
-              <w:keepNext/>
+              <w:keepNext w:val="false"/>
               <w:jc w:val="left"/>
             </w:pPr>
             <w:r>
@@ -6725,18 +5808,18 @@
           </w:tcPr>
           <w:p>
             <w:pPr>
-              <w:keepNext/>
-              <w:jc w:val="center"/>
-            </w:pPr>
-            <w:r>
-              <w:rPr>
-                <w:b w:val="false"/>
-                <w:bCs w:val="false"/>
-                <w:color w:val="000000"/>
-                <w:sz w:val="18"/>
-                <w:szCs w:val="18"/>
-              </w:rPr>
-              <w:t xml:space="preserve">Colonia con robo con violencia alto, 3 o más robos organizados nocturnos o robo alto a las 22:00</w:t>
+              <w:keepNext w:val="false"/>
+              <w:jc w:val="center"/>
+            </w:pPr>
+            <w:r>
+              <w:rPr>
+                <w:b w:val="false"/>
+                <w:bCs w:val="false"/>
+                <w:color w:val="000000"/>
+                <w:sz w:val="18"/>
+                <w:szCs w:val="18"/>
+              </w:rPr>
+              <w:t xml:space="preserve">Colonia con robo con violencia alto o 3 o más robos organizados nocturnos</w:t>
             </w:r>
           </w:p>
         </w:tc>
@@ -6753,18 +5836,18 @@
           </w:tcPr>
           <w:p>
             <w:pPr>
-              <w:keepNext/>
-              <w:jc w:val="center"/>
-            </w:pPr>
-            <w:r>
-              <w:rPr>
-                <w:b w:val="false"/>
-                <w:bCs w:val="false"/>
-                <w:color w:val="000000"/>
-                <w:sz w:val="18"/>
-                <w:szCs w:val="18"/>
-              </w:rPr>
-              <w:t xml:space="preserve">108</w:t>
+              <w:keepNext w:val="false"/>
+              <w:jc w:val="center"/>
+            </w:pPr>
+            <w:r>
+              <w:rPr>
+                <w:b w:val="false"/>
+                <w:bCs w:val="false"/>
+                <w:color w:val="000000"/>
+                <w:sz w:val="18"/>
+                <w:szCs w:val="18"/>
+              </w:rPr>
+              <w:t xml:space="preserve">111</w:t>
             </w:r>
           </w:p>
         </w:tc>
@@ -6772,120 +5855,6 @@
           <w:tcPr>
             <w:tcW w:type="dxa" w:w="1700"/>
             <w:shd w:fill="EEF3F9" w:color="auto" w:val="clear"/>
-            <w:tcMar>
-              <w:top w:type="dxa" w:w="60"/>
-              <w:left w:type="dxa" w:w="100"/>
-              <w:bottom w:type="dxa" w:w="60"/>
-              <w:right w:type="dxa" w:w="100"/>
-            </w:tcMar>
-          </w:tcPr>
-          <w:p>
-            <w:pPr>
-              <w:keepNext/>
-              <w:jc w:val="center"/>
-            </w:pPr>
-            <w:r>
-              <w:rPr>
-                <w:b w:val="false"/>
-                <w:bCs w:val="false"/>
-                <w:color w:val="000000"/>
-                <w:sz w:val="18"/>
-                <w:szCs w:val="18"/>
-              </w:rPr>
-              <w:t xml:space="preserve">$30,421,789</w:t>
-            </w:r>
-          </w:p>
-        </w:tc>
-      </w:tr>
-      <w:tr>
-        <w:trPr>
-          <w:cantSplit/>
-          <w:tblHeader w:val="false"/>
-        </w:trPr>
-        <w:tc>
-          <w:tcPr>
-            <w:tcW w:type="dxa" w:w="2300"/>
-            <w:tcMar>
-              <w:top w:type="dxa" w:w="60"/>
-              <w:left w:type="dxa" w:w="100"/>
-              <w:bottom w:type="dxa" w:w="60"/>
-              <w:right w:type="dxa" w:w="100"/>
-            </w:tcMar>
-          </w:tcPr>
-          <w:p>
-            <w:pPr>
-              <w:keepNext w:val="false"/>
-              <w:jc w:val="left"/>
-            </w:pPr>
-            <w:r>
-              <w:rPr>
-                <w:b/>
-                <w:bCs/>
-                <w:color w:val="000000"/>
-                <w:sz w:val="18"/>
-                <w:szCs w:val="18"/>
-              </w:rPr>
-              <w:t xml:space="preserve">3. Moderada con ventanilla a las 22:00</w:t>
-            </w:r>
-          </w:p>
-        </w:tc>
-        <w:tc>
-          <w:tcPr>
-            <w:tcW w:type="dxa" w:w="4060"/>
-            <w:tcMar>
-              <w:top w:type="dxa" w:w="60"/>
-              <w:left w:type="dxa" w:w="100"/>
-              <w:bottom w:type="dxa" w:w="60"/>
-              <w:right w:type="dxa" w:w="100"/>
-            </w:tcMar>
-          </w:tcPr>
-          <w:p>
-            <w:pPr>
-              <w:keepNext w:val="false"/>
-              <w:jc w:val="center"/>
-            </w:pPr>
-            <w:r>
-              <w:rPr>
-                <w:b w:val="false"/>
-                <w:bCs w:val="false"/>
-                <w:color w:val="000000"/>
-                <w:sz w:val="18"/>
-                <w:szCs w:val="18"/>
-              </w:rPr>
-              <w:t xml:space="preserve">Colonia con robo con violencia alto o 3 o más robos organizados nocturnos. Con robo alto a las 22:00 se retira y se adelanta la ventanilla</w:t>
-            </w:r>
-          </w:p>
-        </w:tc>
-        <w:tc>
-          <w:tcPr>
-            <w:tcW w:type="dxa" w:w="1300"/>
-            <w:tcMar>
-              <w:top w:type="dxa" w:w="60"/>
-              <w:left w:type="dxa" w:w="100"/>
-              <w:bottom w:type="dxa" w:w="60"/>
-              <w:right w:type="dxa" w:w="100"/>
-            </w:tcMar>
-          </w:tcPr>
-          <w:p>
-            <w:pPr>
-              <w:keepNext w:val="false"/>
-              <w:jc w:val="center"/>
-            </w:pPr>
-            <w:r>
-              <w:rPr>
-                <w:b w:val="false"/>
-                <w:bCs w:val="false"/>
-                <w:color w:val="000000"/>
-                <w:sz w:val="18"/>
-                <w:szCs w:val="18"/>
-              </w:rPr>
-              <w:t xml:space="preserve">111</w:t>
-            </w:r>
-          </w:p>
-        </w:tc>
-        <w:tc>
-          <w:tcPr>
-            <w:tcW w:type="dxa" w:w="1700"/>
             <w:tcMar>
               <w:top w:type="dxa" w:w="60"/>
               <w:left w:type="dxa" w:w="100"/>
@@ -6946,7 +5915,7 @@
         <w:spacing w:after="140"/>
       </w:pPr>
       <w:r>
-        <w:t xml:space="preserve">Esta alternativa no aplica el criterio de colonia. Por eso cinco farmacias de la CDMX en colonias con robo con violencia alto pierden el guardia nocturno: F26 Beistegui, F80 Canal de San Juan, F106 Jamaica, F114 Isabel la Católica y F155 Florencia. En las alternativas 2 y 3 lo conservan. Si se agregan como excepción, la alternativa 1 queda en 431 guardias y un ahorro de $21,119,389 al año (15.0%).</w:t>
+        <w:t xml:space="preserve">Esta alternativa no aplica el criterio de colonia. Por eso cinco farmacias de la CDMX en colonias con robo con violencia alto pierden el guardia nocturno: F26 Beistegui, F80 Canal de San Juan, F106 Jamaica, F114 Isabel la Católica y F155 Florencia. En la alternativa 2 lo conservan. Si se agregan como excepción, la alternativa 1 queda en 431 guardias y un ahorro de $21,119,389 al año (15.0%).</w:t>
       </w:r>
     </w:p>
     <w:p>
@@ -7002,9 +5971,8 @@
       </w:tblPr>
       <w:tblGrid>
         <w:gridCol w:w="900"/>
-        <w:gridCol w:w="4060"/>
-        <w:gridCol w:w="2200"/>
-        <w:gridCol w:w="2200"/>
+        <w:gridCol w:w="5260"/>
+        <w:gridCol w:w="3200"/>
       </w:tblGrid>
       <w:tr>
         <w:trPr>
@@ -7041,7 +6009,7 @@
         </w:tc>
         <w:tc>
           <w:tcPr>
-            <w:tcW w:type="dxa" w:w="4060"/>
+            <w:tcW w:type="dxa" w:w="5260"/>
             <w:shd w:fill="1B3A5C" w:color="auto" w:val="clear"/>
             <w:tcMar>
               <w:top w:type="dxa" w:w="60"/>
@@ -7069,7 +6037,7 @@
         </w:tc>
         <w:tc>
           <w:tcPr>
-            <w:tcW w:type="dxa" w:w="2200"/>
+            <w:tcW w:type="dxa" w:w="3200"/>
             <w:shd w:fill="1B3A5C" w:color="auto" w:val="clear"/>
             <w:tcMar>
               <w:top w:type="dxa" w:w="60"/>
@@ -7091,35 +6059,7 @@
                 <w:sz w:val="18"/>
                 <w:szCs w:val="18"/>
               </w:rPr>
-              <w:t xml:space="preserve">Alternativa 2</w:t>
-            </w:r>
-          </w:p>
-        </w:tc>
-        <w:tc>
-          <w:tcPr>
-            <w:tcW w:type="dxa" w:w="2200"/>
-            <w:shd w:fill="1B3A5C" w:color="auto" w:val="clear"/>
-            <w:tcMar>
-              <w:top w:type="dxa" w:w="60"/>
-              <w:left w:type="dxa" w:w="100"/>
-              <w:bottom w:type="dxa" w:w="60"/>
-              <w:right w:type="dxa" w:w="100"/>
-            </w:tcMar>
-          </w:tcPr>
-          <w:p>
-            <w:pPr>
-              <w:keepNext/>
-              <w:jc w:val="center"/>
-            </w:pPr>
-            <w:r>
-              <w:rPr>
-                <w:b/>
-                <w:bCs/>
-                <w:color w:val="FFFFFF"/>
-                <w:sz w:val="18"/>
-                <w:szCs w:val="18"/>
-              </w:rPr>
-              <w:t xml:space="preserve">Alternativa 3</w:t>
+              <w:t xml:space="preserve">Resultado</w:t>
             </w:r>
           </w:p>
         </w:tc>
@@ -7158,7 +6098,7 @@
         </w:tc>
         <w:tc>
           <w:tcPr>
-            <w:tcW w:type="dxa" w:w="4060"/>
+            <w:tcW w:type="dxa" w:w="5260"/>
             <w:tcMar>
               <w:top w:type="dxa" w:w="60"/>
               <w:left w:type="dxa" w:w="100"/>
@@ -7185,34 +6125,7 @@
         </w:tc>
         <w:tc>
           <w:tcPr>
-            <w:tcW w:type="dxa" w:w="2200"/>
-            <w:tcMar>
-              <w:top w:type="dxa" w:w="60"/>
-              <w:left w:type="dxa" w:w="100"/>
-              <w:bottom w:type="dxa" w:w="60"/>
-              <w:right w:type="dxa" w:w="100"/>
-            </w:tcMar>
-          </w:tcPr>
-          <w:p>
-            <w:pPr>
-              <w:keepNext/>
-              <w:jc w:val="center"/>
-            </w:pPr>
-            <w:r>
-              <w:rPr>
-                <w:b w:val="false"/>
-                <w:bCs w:val="false"/>
-                <w:color w:val="000000"/>
-                <w:sz w:val="18"/>
-                <w:szCs w:val="18"/>
-              </w:rPr>
-              <w:t xml:space="preserve">Conserva</w:t>
-            </w:r>
-          </w:p>
-        </w:tc>
-        <w:tc>
-          <w:tcPr>
-            <w:tcW w:type="dxa" w:w="2200"/>
+            <w:tcW w:type="dxa" w:w="3200"/>
             <w:tcMar>
               <w:top w:type="dxa" w:w="60"/>
               <w:left w:type="dxa" w:w="100"/>
@@ -7273,7 +6186,7 @@
         </w:tc>
         <w:tc>
           <w:tcPr>
-            <w:tcW w:type="dxa" w:w="4060"/>
+            <w:tcW w:type="dxa" w:w="5260"/>
             <w:shd w:fill="EEF3F9" w:color="auto" w:val="clear"/>
             <w:tcMar>
               <w:top w:type="dxa" w:w="60"/>
@@ -7301,35 +6214,7 @@
         </w:tc>
         <w:tc>
           <w:tcPr>
-            <w:tcW w:type="dxa" w:w="2200"/>
-            <w:shd w:fill="EEF3F9" w:color="auto" w:val="clear"/>
-            <w:tcMar>
-              <w:top w:type="dxa" w:w="60"/>
-              <w:left w:type="dxa" w:w="100"/>
-              <w:bottom w:type="dxa" w:w="60"/>
-              <w:right w:type="dxa" w:w="100"/>
-            </w:tcMar>
-          </w:tcPr>
-          <w:p>
-            <w:pPr>
-              <w:keepNext/>
-              <w:jc w:val="center"/>
-            </w:pPr>
-            <w:r>
-              <w:rPr>
-                <w:b w:val="false"/>
-                <w:bCs w:val="false"/>
-                <w:color w:val="000000"/>
-                <w:sz w:val="18"/>
-                <w:szCs w:val="18"/>
-              </w:rPr>
-              <w:t xml:space="preserve">Conserva</w:t>
-            </w:r>
-          </w:p>
-        </w:tc>
-        <w:tc>
-          <w:tcPr>
-            <w:tcW w:type="dxa" w:w="2200"/>
+            <w:tcW w:type="dxa" w:w="3200"/>
             <w:shd w:fill="EEF3F9" w:color="auto" w:val="clear"/>
             <w:tcMar>
               <w:top w:type="dxa" w:w="60"/>
@@ -7390,7 +6275,7 @@
         </w:tc>
         <w:tc>
           <w:tcPr>
-            <w:tcW w:type="dxa" w:w="4060"/>
+            <w:tcW w:type="dxa" w:w="5260"/>
             <w:tcMar>
               <w:top w:type="dxa" w:w="60"/>
               <w:left w:type="dxa" w:w="100"/>
@@ -7417,34 +6302,7 @@
         </w:tc>
         <w:tc>
           <w:tcPr>
-            <w:tcW w:type="dxa" w:w="2200"/>
-            <w:tcMar>
-              <w:top w:type="dxa" w:w="60"/>
-              <w:left w:type="dxa" w:w="100"/>
-              <w:bottom w:type="dxa" w:w="60"/>
-              <w:right w:type="dxa" w:w="100"/>
-            </w:tcMar>
-          </w:tcPr>
-          <w:p>
-            <w:pPr>
-              <w:keepNext/>
-              <w:jc w:val="center"/>
-            </w:pPr>
-            <w:r>
-              <w:rPr>
-                <w:b w:val="false"/>
-                <w:bCs w:val="false"/>
-                <w:color w:val="000000"/>
-                <w:sz w:val="18"/>
-                <w:szCs w:val="18"/>
-              </w:rPr>
-              <w:t xml:space="preserve">Sin cambio hasta revisarse</w:t>
-            </w:r>
-          </w:p>
-        </w:tc>
-        <w:tc>
-          <w:tcPr>
-            <w:tcW w:type="dxa" w:w="2200"/>
+            <w:tcW w:type="dxa" w:w="3200"/>
             <w:tcMar>
               <w:top w:type="dxa" w:w="60"/>
               <w:left w:type="dxa" w:w="100"/>
@@ -7505,7 +6363,7 @@
         </w:tc>
         <w:tc>
           <w:tcPr>
-            <w:tcW w:type="dxa" w:w="4060"/>
+            <w:tcW w:type="dxa" w:w="5260"/>
             <w:shd w:fill="EEF3F9" w:color="auto" w:val="clear"/>
             <w:tcMar>
               <w:top w:type="dxa" w:w="60"/>
@@ -7533,35 +6391,7 @@
         </w:tc>
         <w:tc>
           <w:tcPr>
-            <w:tcW w:type="dxa" w:w="2200"/>
-            <w:shd w:fill="EEF3F9" w:color="auto" w:val="clear"/>
-            <w:tcMar>
-              <w:top w:type="dxa" w:w="60"/>
-              <w:left w:type="dxa" w:w="100"/>
-              <w:bottom w:type="dxa" w:w="60"/>
-              <w:right w:type="dxa" w:w="100"/>
-            </w:tcMar>
-          </w:tcPr>
-          <w:p>
-            <w:pPr>
-              <w:keepNext/>
-              <w:jc w:val="center"/>
-            </w:pPr>
-            <w:r>
-              <w:rPr>
-                <w:b w:val="false"/>
-                <w:bCs w:val="false"/>
-                <w:color w:val="000000"/>
-                <w:sz w:val="18"/>
-                <w:szCs w:val="18"/>
-              </w:rPr>
-              <w:t xml:space="preserve">Conserva</w:t>
-            </w:r>
-          </w:p>
-        </w:tc>
-        <w:tc>
-          <w:tcPr>
-            <w:tcW w:type="dxa" w:w="2200"/>
+            <w:tcW w:type="dxa" w:w="3200"/>
             <w:shd w:fill="EEF3F9" w:color="auto" w:val="clear"/>
             <w:tcMar>
               <w:top w:type="dxa" w:w="60"/>
@@ -7622,7 +6452,7 @@
         </w:tc>
         <w:tc>
           <w:tcPr>
-            <w:tcW w:type="dxa" w:w="4060"/>
+            <w:tcW w:type="dxa" w:w="5260"/>
             <w:tcMar>
               <w:top w:type="dxa" w:w="60"/>
               <w:left w:type="dxa" w:w="100"/>
@@ -7649,34 +6479,7 @@
         </w:tc>
         <w:tc>
           <w:tcPr>
-            <w:tcW w:type="dxa" w:w="2200"/>
-            <w:tcMar>
-              <w:top w:type="dxa" w:w="60"/>
-              <w:left w:type="dxa" w:w="100"/>
-              <w:bottom w:type="dxa" w:w="60"/>
-              <w:right w:type="dxa" w:w="100"/>
-            </w:tcMar>
-          </w:tcPr>
-          <w:p>
-            <w:pPr>
-              <w:keepNext w:val="false"/>
-              <w:jc w:val="center"/>
-            </w:pPr>
-            <w:r>
-              <w:rPr>
-                <w:b w:val="false"/>
-                <w:bCs w:val="false"/>
-                <w:color w:val="000000"/>
-                <w:sz w:val="18"/>
-                <w:szCs w:val="18"/>
-              </w:rPr>
-              <w:t xml:space="preserve">Se retira</w:t>
-            </w:r>
-          </w:p>
-        </w:tc>
-        <w:tc>
-          <w:tcPr>
-            <w:tcW w:type="dxa" w:w="2200"/>
+            <w:tcW w:type="dxa" w:w="3200"/>
             <w:tcMar>
               <w:top w:type="dxa" w:w="60"/>
               <w:left w:type="dxa" w:w="100"/>
@@ -7713,7 +6516,7 @@
         <w:spacing w:after="140"/>
       </w:pPr>
       <w:r>
-        <w:t xml:space="preserve">Comprende 108 farmacias, 61 foráneas y 47 de la CDMX. Respecto a la alternativa 1, agrega 34 farmacias de la CDMX que conservaban el guardia por venta nocturna, alcaldía o dos robos organizados, y lo mantiene en las cinco farmacias en colonia con violencia. La lista está en los anexos 1 y 3.</w:t>
+        <w:t xml:space="preserve">Comprende 111 farmacias, 61 foráneas y 50 de la CDMX. Respecto a la alternativa 1, agrega 37 farmacias de la CDMX que conservaban el guardia por venta nocturna, alcaldía o dos robos organizados, y lo mantiene en las cinco farmacias en colonia con violencia. La lista está en los anexos 1 y 3.</w:t>
       </w:r>
     </w:p>
     <w:p>
@@ -7721,37 +6524,7 @@
         <w:spacing w:after="140"/>
       </w:pPr>
       <w:r>
-        <w:t xml:space="preserve">Conservan el guardia nocturno 79 farmacias. En la CDMX son 41: 21 por colonia con violencia, 1 con colonia en revisión, 10 por robo organizado, 6 en revisión de horario y 3 por robo alto a las 22:00. En las foráneas son 38: 33 por venta nocturna, 2 por robo organizado y 3 en revisión de horario.</w:t>
-      </w:r>
-    </w:p>
-    <w:p>
-      <w:pPr>
-        <w:tabs>
-          <w:tab w:val="left" w:pos="2600"/>
-        </w:tabs>
-        <w:spacing w:after="140"/>
-      </w:pPr>
-      <w:r>
-        <w:rPr>
-          <w:b/>
-          <w:bCs/>
-        </w:rPr>
-        <w:t xml:space="preserve">108 guardias retirados</w:t>
-      </w:r>
-      <w:r>
-        <w:rPr>
-          <w:b/>
-          <w:bCs/>
-        </w:rPr>
-        <w:t xml:space="preserve">	Ahorro anual: $30,421,789</w:t>
-      </w:r>
-    </w:p>
-    <w:p>
-      <w:pPr>
-        <w:pStyle w:val="Heading2"/>
-      </w:pPr>
-      <w:r>
-        <w:t xml:space="preserve">5.3 Alternativa 3. Moderada con ventanilla a las 22:00</w:t>
+        <w:t xml:space="preserve">Conservan el guardia nocturno 76 farmacias. En la CDMX son 38: 21 por colonia con violencia, 1 con colonia en revisión, 10 por robo organizado y 6 en revisión de horario. En las foráneas son 38: 33 por venta nocturna, 2 por robo organizado y 3 en revisión de horario.</w:t>
       </w:r>
     </w:p>
     <w:p>
@@ -7760,7 +6533,7 @@
         <w:spacing w:after="140"/>
       </w:pPr>
       <w:r>
-        <w:t xml:space="preserve">Aplica las reglas de la alternativa 2, salvo en las tres farmacias de la CDMX con venta nocturna y tres o más robos entre las 22:00 y las 22:59. En ellas se retira el guardia nocturno y se adelanta el cambio a ventanilla a las 22:00, la hora en que se concentra el robo nocturno.</w:t>
+        <w:t xml:space="preserve">En las tres farmacias con venta nocturna y tres o más robos entre las 22:00 y las 22:59 se retira el guardia y se adelanta el cambio a ventanilla a las 22:00, la hora en que se concentra el robo nocturno.</w:t>
       </w:r>
     </w:p>
     <w:tbl>
@@ -8367,15 +7140,7 @@
         <w:spacing w:after="140"/>
       </w:pPr>
       <w:r>
-        <w:t xml:space="preserve">Comprende 111 farmacias, 61 foráneas y 50 de la CDMX. La lista está en los anexos 1 y 3. Conservan el guardia nocturno 76 farmacias, 38 de la CDMX y 38 foráneas.</w:t>
-      </w:r>
-    </w:p>
-    <w:p>
-      <w:pPr>
-        <w:spacing w:after="140"/>
-      </w:pPr>
-      <w:r>
-        <w:t xml:space="preserve">Frente a la alternativa 2, ahorra $820,800 más al año. Requiere confirmar con Operaciones que las tres farmacias pueden atender por ventanilla desde las 22:00.</w:t>
+        <w:t xml:space="preserve">Requiere confirmar con Operaciones que estas farmacias pueden atender por ventanilla desde las 22:00. Si no es posible, conservan el guardia y el ahorro de la alternativa 2 baja a $30,421,789 al año (21.7%).</w:t>
       </w:r>
     </w:p>
     <w:p>
@@ -8405,7 +7170,7 @@
         <w:pStyle w:val="Heading2"/>
       </w:pPr>
       <w:r>
-        <w:t xml:space="preserve">5.4 Diferencias entre alternativas</w:t>
+        <w:t xml:space="preserve">5.3 Diferencias entre alternativas</w:t>
       </w:r>
     </w:p>
     <w:tbl>
@@ -8788,7 +7553,7 @@
           </w:tcPr>
           <w:p>
             <w:pPr>
-              <w:keepNext/>
+              <w:keepNext w:val="false"/>
               <w:jc w:val="left"/>
             </w:pPr>
             <w:r>
@@ -8816,18 +7581,18 @@
           </w:tcPr>
           <w:p>
             <w:pPr>
-              <w:keepNext/>
-              <w:jc w:val="center"/>
-            </w:pPr>
-            <w:r>
-              <w:rPr>
-                <w:b w:val="false"/>
-                <w:bCs w:val="false"/>
-                <w:color w:val="000000"/>
-                <w:sz w:val="18"/>
-                <w:szCs w:val="18"/>
-              </w:rPr>
-              <w:t xml:space="preserve">29</w:t>
+              <w:keepNext w:val="false"/>
+              <w:jc w:val="center"/>
+            </w:pPr>
+            <w:r>
+              <w:rPr>
+                <w:b w:val="false"/>
+                <w:bCs w:val="false"/>
+                <w:color w:val="000000"/>
+                <w:sz w:val="18"/>
+                <w:szCs w:val="18"/>
+              </w:rPr>
+              <w:t xml:space="preserve">32</w:t>
             </w:r>
           </w:p>
         </w:tc>
@@ -8844,18 +7609,18 @@
           </w:tcPr>
           <w:p>
             <w:pPr>
-              <w:keepNext/>
-              <w:jc w:val="center"/>
-            </w:pPr>
-            <w:r>
-              <w:rPr>
-                <w:b w:val="false"/>
-                <w:bCs w:val="false"/>
-                <w:color w:val="000000"/>
-                <w:sz w:val="18"/>
-                <w:szCs w:val="18"/>
-              </w:rPr>
-              <w:t xml:space="preserve">$7,934,400</w:t>
+              <w:keepNext w:val="false"/>
+              <w:jc w:val="center"/>
+            </w:pPr>
+            <w:r>
+              <w:rPr>
+                <w:b w:val="false"/>
+                <w:bCs w:val="false"/>
+                <w:color w:val="000000"/>
+                <w:sz w:val="18"/>
+                <w:szCs w:val="18"/>
+              </w:rPr>
+              <w:t xml:space="preserve">$8,755,200</w:t>
             </w:r>
           </w:p>
         </w:tc>
@@ -8872,18 +7637,18 @@
           </w:tcPr>
           <w:p>
             <w:pPr>
-              <w:keepNext/>
-              <w:jc w:val="center"/>
-            </w:pPr>
-            <w:r>
-              <w:rPr>
-                <w:b w:val="false"/>
-                <w:bCs w:val="false"/>
-                <w:color w:val="000000"/>
-                <w:sz w:val="18"/>
-                <w:szCs w:val="18"/>
-              </w:rPr>
-              <w:t xml:space="preserve">19</w:t>
+              <w:keepNext w:val="false"/>
+              <w:jc w:val="center"/>
+            </w:pPr>
+            <w:r>
+              <w:rPr>
+                <w:b w:val="false"/>
+                <w:bCs w:val="false"/>
+                <w:color w:val="000000"/>
+                <w:sz w:val="18"/>
+                <w:szCs w:val="18"/>
+              </w:rPr>
+              <w:t xml:space="preserve">25</w:t>
             </w:r>
           </w:p>
         </w:tc>
@@ -8900,18 +7665,18 @@
           </w:tcPr>
           <w:p>
             <w:pPr>
-              <w:keepNext/>
-              <w:jc w:val="center"/>
-            </w:pPr>
-            <w:r>
-              <w:rPr>
-                <w:b w:val="false"/>
-                <w:bCs w:val="false"/>
-                <w:color w:val="000000"/>
-                <w:sz w:val="18"/>
-                <w:szCs w:val="18"/>
-              </w:rPr>
-              <w:t xml:space="preserve">$273,914</w:t>
+              <w:keepNext w:val="false"/>
+              <w:jc w:val="center"/>
+            </w:pPr>
+            <w:r>
+              <w:rPr>
+                <w:b w:val="false"/>
+                <w:bCs w:val="false"/>
+                <w:color w:val="000000"/>
+                <w:sz w:val="18"/>
+                <w:szCs w:val="18"/>
+              </w:rPr>
+              <w:t xml:space="preserve">$322,394</w:t>
             </w:r>
           </w:p>
         </w:tc>
@@ -8928,186 +7693,18 @@
           </w:tcPr>
           <w:p>
             <w:pPr>
-              <w:keepNext/>
-              <w:jc w:val="center"/>
-            </w:pPr>
-            <w:r>
-              <w:rPr>
-                <w:b w:val="false"/>
-                <w:bCs w:val="false"/>
-                <w:color w:val="000000"/>
-                <w:sz w:val="18"/>
-                <w:szCs w:val="18"/>
-              </w:rPr>
-              <w:t xml:space="preserve">17 veces</w:t>
-            </w:r>
-          </w:p>
-        </w:tc>
-      </w:tr>
-      <w:tr>
-        <w:trPr>
-          <w:cantSplit/>
-          <w:tblHeader w:val="false"/>
-        </w:trPr>
-        <w:tc>
-          <w:tcPr>
-            <w:tcW w:type="dxa" w:w="2060"/>
-            <w:tcMar>
-              <w:top w:type="dxa" w:w="60"/>
-              <w:left w:type="dxa" w:w="100"/>
-              <w:bottom w:type="dxa" w:w="60"/>
-              <w:right w:type="dxa" w:w="100"/>
-            </w:tcMar>
-          </w:tcPr>
-          <w:p>
-            <w:pPr>
-              <w:keepNext w:val="false"/>
-              <w:jc w:val="left"/>
-            </w:pPr>
-            <w:r>
-              <w:rPr>
-                <w:b/>
-                <w:bCs/>
-                <w:color w:val="000000"/>
-                <w:sz w:val="18"/>
-                <w:szCs w:val="18"/>
-              </w:rPr>
-              <w:t xml:space="preserve">De la alternativa 2 a la 3</w:t>
-            </w:r>
-          </w:p>
-        </w:tc>
-        <w:tc>
-          <w:tcPr>
-            <w:tcW w:type="dxa" w:w="1300"/>
-            <w:tcMar>
-              <w:top w:type="dxa" w:w="60"/>
-              <w:left w:type="dxa" w:w="100"/>
-              <w:bottom w:type="dxa" w:w="60"/>
-              <w:right w:type="dxa" w:w="100"/>
-            </w:tcMar>
-          </w:tcPr>
-          <w:p>
-            <w:pPr>
-              <w:keepNext w:val="false"/>
-              <w:jc w:val="center"/>
-            </w:pPr>
-            <w:r>
-              <w:rPr>
-                <w:b w:val="false"/>
-                <w:bCs w:val="false"/>
-                <w:color w:val="000000"/>
-                <w:sz w:val="18"/>
-                <w:szCs w:val="18"/>
-              </w:rPr>
-              <w:t xml:space="preserve">3</w:t>
-            </w:r>
-          </w:p>
-        </w:tc>
-        <w:tc>
-          <w:tcPr>
-            <w:tcW w:type="dxa" w:w="1700"/>
-            <w:tcMar>
-              <w:top w:type="dxa" w:w="60"/>
-              <w:left w:type="dxa" w:w="100"/>
-              <w:bottom w:type="dxa" w:w="60"/>
-              <w:right w:type="dxa" w:w="100"/>
-            </w:tcMar>
-          </w:tcPr>
-          <w:p>
-            <w:pPr>
-              <w:keepNext w:val="false"/>
-              <w:jc w:val="center"/>
-            </w:pPr>
-            <w:r>
-              <w:rPr>
-                <w:b w:val="false"/>
-                <w:bCs w:val="false"/>
-                <w:color w:val="000000"/>
-                <w:sz w:val="18"/>
-                <w:szCs w:val="18"/>
-              </w:rPr>
-              <w:t xml:space="preserve">$820,800</w:t>
-            </w:r>
-          </w:p>
-        </w:tc>
-        <w:tc>
-          <w:tcPr>
-            <w:tcW w:type="dxa" w:w="1500"/>
-            <w:tcMar>
-              <w:top w:type="dxa" w:w="60"/>
-              <w:left w:type="dxa" w:w="100"/>
-              <w:bottom w:type="dxa" w:w="60"/>
-              <w:right w:type="dxa" w:w="100"/>
-            </w:tcMar>
-          </w:tcPr>
-          <w:p>
-            <w:pPr>
-              <w:keepNext w:val="false"/>
-              <w:jc w:val="center"/>
-            </w:pPr>
-            <w:r>
-              <w:rPr>
-                <w:b w:val="false"/>
-                <w:bCs w:val="false"/>
-                <w:color w:val="000000"/>
-                <w:sz w:val="18"/>
-                <w:szCs w:val="18"/>
-              </w:rPr>
-              <w:t xml:space="preserve">6</w:t>
-            </w:r>
-          </w:p>
-        </w:tc>
-        <w:tc>
-          <w:tcPr>
-            <w:tcW w:type="dxa" w:w="1500"/>
-            <w:tcMar>
-              <w:top w:type="dxa" w:w="60"/>
-              <w:left w:type="dxa" w:w="100"/>
-              <w:bottom w:type="dxa" w:w="60"/>
-              <w:right w:type="dxa" w:w="100"/>
-            </w:tcMar>
-          </w:tcPr>
-          <w:p>
-            <w:pPr>
-              <w:keepNext w:val="false"/>
-              <w:jc w:val="center"/>
-            </w:pPr>
-            <w:r>
-              <w:rPr>
-                <w:b w:val="false"/>
-                <w:bCs w:val="false"/>
-                <w:color w:val="000000"/>
-                <w:sz w:val="18"/>
-                <w:szCs w:val="18"/>
-              </w:rPr>
-              <w:t xml:space="preserve">$48,479</w:t>
-            </w:r>
-          </w:p>
-        </w:tc>
-        <w:tc>
-          <w:tcPr>
-            <w:tcW w:type="dxa" w:w="1300"/>
-            <w:tcMar>
-              <w:top w:type="dxa" w:w="60"/>
-              <w:left w:type="dxa" w:w="100"/>
-              <w:bottom w:type="dxa" w:w="60"/>
-              <w:right w:type="dxa" w:w="100"/>
-            </w:tcMar>
-          </w:tcPr>
-          <w:p>
-            <w:pPr>
-              <w:keepNext w:val="false"/>
-              <w:jc w:val="center"/>
-            </w:pPr>
-            <w:r>
-              <w:rPr>
-                <w:b w:val="false"/>
-                <w:bCs w:val="false"/>
-                <w:color w:val="000000"/>
-                <w:sz w:val="18"/>
-                <w:szCs w:val="18"/>
-              </w:rPr>
-              <w:t xml:space="preserve">10 veces</w:t>
+              <w:keepNext w:val="false"/>
+              <w:jc w:val="center"/>
+            </w:pPr>
+            <w:r>
+              <w:rPr>
+                <w:b w:val="false"/>
+                <w:bCs w:val="false"/>
+                <w:color w:val="000000"/>
+                <w:sz w:val="18"/>
+                <w:szCs w:val="18"/>
+              </w:rPr>
+              <w:t xml:space="preserve">16 veces</w:t>
             </w:r>
           </w:p>
         </w:tc>
@@ -9123,7 +7720,7 @@
         <w:spacing w:after="140"/>
       </w:pPr>
       <w:r>
-        <w:t xml:space="preserve">El paso de la alternativa 1 a la 2 agrega $7.9 millones al año con 19 robos nocturnos más en siete meses. El paso de la 2 a la 3 agrega $0.8 millones en tres farmacias que registraron 10 robos entre las 22:00 y las 22:59 de enero de 2025 a septiembre de 2026. En los tres pasos el ahorro supera al monto robado en los turnos que se retiran, pero la relación baja de 67 a 17 y a 10 veces.</w:t>
+        <w:t xml:space="preserve">El paso de la alternativa 1 a la 2 retira 37 guardias más y conserva los 5 de las farmacias en colonia con violencia. Agrega $8.8 millones al año con 25 robos nocturnos más en siete meses. En los dos casos el ahorro supera al monto robado en los turnos que se retiran, pero la relación baja de 67 a 16 veces.</w:t>
       </w:r>
     </w:p>
     <w:p>
@@ -9131,7 +7728,7 @@
         <w:pStyle w:val="Heading2"/>
       </w:pPr>
       <w:r>
-        <w:t xml:space="preserve">5.5 Seguimiento y regla de regreso</w:t>
+        <w:t xml:space="preserve">5.4 Seguimiento y regla de regreso</w:t>
       </w:r>
     </w:p>
     <w:p>
@@ -9139,7 +7736,7 @@
         <w:spacing w:after="140"/>
       </w:pPr>
       <w:r>
-        <w:t xml:space="preserve">En cualquier alternativa se propone un periodo de observación de </w:t>
+        <w:t xml:space="preserve">En cualquiera de las dos alternativas se propone un periodo de observación de </w:t>
       </w:r>
       <w:r>
         <w:rPr>
@@ -9165,7 +7762,7 @@
         <w:t xml:space="preserve">dos</w:t>
       </w:r>
       <w:r>
-        <w:t xml:space="preserve"> robos nocturnos en un mismo mes. En la alternativa 3 también se revisa que las tres farmacias con ventanilla a las 22:00 cumplan el nuevo horario.</w:t>
+        <w:t xml:space="preserve"> robos nocturnos en un mismo mes. En la alternativa 2 también se revisa que las tres farmacias con ventanilla a las 22:00 cumplan el nuevo horario.</w:t>
       </w:r>
     </w:p>
     <w:p>
@@ -9206,7 +7803,7 @@
         <w:pageBreakBefore/>
       </w:pPr>
       <w:r>
-        <w:t xml:space="preserve">Anexo 1. Farmacias sin guardia nocturno en las tres alternativas</w:t>
+        <w:t xml:space="preserve">Anexo 1. Farmacias sin guardia nocturno en las dos alternativas</w:t>
       </w:r>
     </w:p>
     <w:tbl>
@@ -20196,7 +18793,7 @@
                 <w:sz w:val="18"/>
                 <w:szCs w:val="18"/>
               </w:rPr>
-              <w:t xml:space="preserve">Motivo para conservar en las alternativas 2 y 3</w:t>
+              <w:t xml:space="preserve">Motivo para conservar en la alternativa 2</w:t>
             </w:r>
           </w:p>
         </w:tc>
@@ -21064,7 +19661,7 @@
         <w:pStyle w:val="Heading1"/>
       </w:pPr>
       <w:r>
-        <w:t xml:space="preserve">Anexo 3. Farmacias sin guardia nocturno en las alternativas 2 y 3</w:t>
+        <w:t xml:space="preserve">Anexo 3. Farmacias sin guardia nocturno solo en la alternativa 2</w:t>
       </w:r>
     </w:p>
     <w:p>
@@ -21073,7 +19670,7 @@
         <w:spacing w:after="140"/>
       </w:pPr>
       <w:r>
-        <w:t xml:space="preserve">Las 37 farmacias son de la CDMX y su guardia es de HT SICHERHEIT. La tabla indica por qué cada una conserva el guardia en la alternativa 1, sus robos entre las 22:00 y las 22:59 de enero de 2025 a septiembre de 2026 y en qué alternativas pierde el guardia nocturno.</w:t>
+        <w:t xml:space="preserve">Las 37 farmacias son de la CDMX y su guardia es de HT SICHERHEIT. La tabla indica por qué cada una conserva el guardia en la alternativa 1, sus robos entre las 22:00 y las 22:59 de enero de 2025 a septiembre de 2026 y si se propone adelantar su ventanilla a las 22:00.</w:t>
       </w:r>
     </w:p>
     <w:tbl>
@@ -21294,7 +19891,7 @@
                 <w:sz w:val="18"/>
                 <w:szCs w:val="18"/>
               </w:rPr>
-              <w:t xml:space="preserve">Alternativas</w:t>
+              <w:t xml:space="preserve">Ventanilla a las 22:00</w:t>
             </w:r>
           </w:p>
         </w:tc>
@@ -21489,7 +20086,7 @@
                 <w:sz w:val="18"/>
                 <w:szCs w:val="18"/>
               </w:rPr>
-              <w:t xml:space="preserve">2 y 3</w:t>
+              <w:t xml:space="preserve"/>
             </w:r>
           </w:p>
         </w:tc>
@@ -21691,7 +20288,7 @@
                 <w:sz w:val="18"/>
                 <w:szCs w:val="18"/>
               </w:rPr>
-              <w:t xml:space="preserve">2 y 3</w:t>
+              <w:t xml:space="preserve"/>
             </w:r>
           </w:p>
         </w:tc>
@@ -21886,7 +20483,7 @@
                 <w:sz w:val="18"/>
                 <w:szCs w:val="18"/>
               </w:rPr>
-              <w:t xml:space="preserve">2 y 3</w:t>
+              <w:t xml:space="preserve"/>
             </w:r>
           </w:p>
         </w:tc>
@@ -22088,7 +20685,7 @@
                 <w:sz w:val="18"/>
                 <w:szCs w:val="18"/>
               </w:rPr>
-              <w:t xml:space="preserve">2 y 3</w:t>
+              <w:t xml:space="preserve"/>
             </w:r>
           </w:p>
         </w:tc>
@@ -22283,7 +20880,7 @@
                 <w:sz w:val="18"/>
                 <w:szCs w:val="18"/>
               </w:rPr>
-              <w:t xml:space="preserve">2 y 3</w:t>
+              <w:t xml:space="preserve"/>
             </w:r>
           </w:p>
         </w:tc>
@@ -22485,7 +21082,7 @@
                 <w:sz w:val="18"/>
                 <w:szCs w:val="18"/>
               </w:rPr>
-              <w:t xml:space="preserve">2 y 3</w:t>
+              <w:t xml:space="preserve"/>
             </w:r>
           </w:p>
         </w:tc>
@@ -22680,7 +21277,7 @@
                 <w:sz w:val="18"/>
                 <w:szCs w:val="18"/>
               </w:rPr>
-              <w:t xml:space="preserve">2 y 3</w:t>
+              <w:t xml:space="preserve"/>
             </w:r>
           </w:p>
         </w:tc>
@@ -22882,7 +21479,7 @@
                 <w:sz w:val="18"/>
                 <w:szCs w:val="18"/>
               </w:rPr>
-              <w:t xml:space="preserve">2 y 3</w:t>
+              <w:t xml:space="preserve"/>
             </w:r>
           </w:p>
         </w:tc>
@@ -23077,7 +21674,7 @@
                 <w:sz w:val="18"/>
                 <w:szCs w:val="18"/>
               </w:rPr>
-              <w:t xml:space="preserve">2 y 3</w:t>
+              <w:t xml:space="preserve"/>
             </w:r>
           </w:p>
         </w:tc>
@@ -23279,7 +21876,7 @@
                 <w:sz w:val="18"/>
                 <w:szCs w:val="18"/>
               </w:rPr>
-              <w:t xml:space="preserve">2 y 3</w:t>
+              <w:t xml:space="preserve"/>
             </w:r>
           </w:p>
         </w:tc>
@@ -23474,7 +22071,7 @@
                 <w:sz w:val="18"/>
                 <w:szCs w:val="18"/>
               </w:rPr>
-              <w:t xml:space="preserve">Solo 3</w:t>
+              <w:t xml:space="preserve">Sí</w:t>
             </w:r>
           </w:p>
         </w:tc>
@@ -23676,7 +22273,7 @@
                 <w:sz w:val="18"/>
                 <w:szCs w:val="18"/>
               </w:rPr>
-              <w:t xml:space="preserve">2 y 3</w:t>
+              <w:t xml:space="preserve"/>
             </w:r>
           </w:p>
         </w:tc>
@@ -23871,7 +22468,7 @@
                 <w:sz w:val="18"/>
                 <w:szCs w:val="18"/>
               </w:rPr>
-              <w:t xml:space="preserve">2 y 3</w:t>
+              <w:t xml:space="preserve"/>
             </w:r>
           </w:p>
         </w:tc>
@@ -24073,7 +22670,7 @@
                 <w:sz w:val="18"/>
                 <w:szCs w:val="18"/>
               </w:rPr>
-              <w:t xml:space="preserve">2 y 3</w:t>
+              <w:t xml:space="preserve"/>
             </w:r>
           </w:p>
         </w:tc>
@@ -24268,7 +22865,7 @@
                 <w:sz w:val="18"/>
                 <w:szCs w:val="18"/>
               </w:rPr>
-              <w:t xml:space="preserve">2 y 3</w:t>
+              <w:t xml:space="preserve"/>
             </w:r>
           </w:p>
         </w:tc>
@@ -24470,7 +23067,7 @@
                 <w:sz w:val="18"/>
                 <w:szCs w:val="18"/>
               </w:rPr>
-              <w:t xml:space="preserve">2 y 3</w:t>
+              <w:t xml:space="preserve"/>
             </w:r>
           </w:p>
         </w:tc>
@@ -24665,7 +23262,7 @@
                 <w:sz w:val="18"/>
                 <w:szCs w:val="18"/>
               </w:rPr>
-              <w:t xml:space="preserve">2 y 3</w:t>
+              <w:t xml:space="preserve"/>
             </w:r>
           </w:p>
         </w:tc>
@@ -24867,7 +23464,7 @@
                 <w:sz w:val="18"/>
                 <w:szCs w:val="18"/>
               </w:rPr>
-              <w:t xml:space="preserve">2 y 3</w:t>
+              <w:t xml:space="preserve"/>
             </w:r>
           </w:p>
         </w:tc>
@@ -25062,7 +23659,7 @@
                 <w:sz w:val="18"/>
                 <w:szCs w:val="18"/>
               </w:rPr>
-              <w:t xml:space="preserve">Solo 3</w:t>
+              <w:t xml:space="preserve">Sí</w:t>
             </w:r>
           </w:p>
         </w:tc>
@@ -25264,7 +23861,7 @@
                 <w:sz w:val="18"/>
                 <w:szCs w:val="18"/>
               </w:rPr>
-              <w:t xml:space="preserve">2 y 3</w:t>
+              <w:t xml:space="preserve"/>
             </w:r>
           </w:p>
         </w:tc>
@@ -25459,7 +24056,7 @@
                 <w:sz w:val="18"/>
                 <w:szCs w:val="18"/>
               </w:rPr>
-              <w:t xml:space="preserve">2 y 3</w:t>
+              <w:t xml:space="preserve"/>
             </w:r>
           </w:p>
         </w:tc>
@@ -25661,7 +24258,7 @@
                 <w:sz w:val="18"/>
                 <w:szCs w:val="18"/>
               </w:rPr>
-              <w:t xml:space="preserve">2 y 3</w:t>
+              <w:t xml:space="preserve"/>
             </w:r>
           </w:p>
         </w:tc>
@@ -25856,7 +24453,7 @@
                 <w:sz w:val="18"/>
                 <w:szCs w:val="18"/>
               </w:rPr>
-              <w:t xml:space="preserve">2 y 3</w:t>
+              <w:t xml:space="preserve"/>
             </w:r>
           </w:p>
         </w:tc>
@@ -26058,7 +24655,7 @@
                 <w:sz w:val="18"/>
                 <w:szCs w:val="18"/>
               </w:rPr>
-              <w:t xml:space="preserve">2 y 3</w:t>
+              <w:t xml:space="preserve"/>
             </w:r>
           </w:p>
         </w:tc>
@@ -26253,7 +24850,7 @@
                 <w:sz w:val="18"/>
                 <w:szCs w:val="18"/>
               </w:rPr>
-              <w:t xml:space="preserve">2 y 3</w:t>
+              <w:t xml:space="preserve"/>
             </w:r>
           </w:p>
         </w:tc>
@@ -26455,7 +25052,7 @@
                 <w:sz w:val="18"/>
                 <w:szCs w:val="18"/>
               </w:rPr>
-              <w:t xml:space="preserve">2 y 3</w:t>
+              <w:t xml:space="preserve"/>
             </w:r>
           </w:p>
         </w:tc>
@@ -26650,7 +25247,7 @@
                 <w:sz w:val="18"/>
                 <w:szCs w:val="18"/>
               </w:rPr>
-              <w:t xml:space="preserve">2 y 3</w:t>
+              <w:t xml:space="preserve"/>
             </w:r>
           </w:p>
         </w:tc>
@@ -26852,7 +25449,7 @@
                 <w:sz w:val="18"/>
                 <w:szCs w:val="18"/>
               </w:rPr>
-              <w:t xml:space="preserve">2 y 3</w:t>
+              <w:t xml:space="preserve"/>
             </w:r>
           </w:p>
         </w:tc>
@@ -27047,7 +25644,7 @@
                 <w:sz w:val="18"/>
                 <w:szCs w:val="18"/>
               </w:rPr>
-              <w:t xml:space="preserve">2 y 3</w:t>
+              <w:t xml:space="preserve"/>
             </w:r>
           </w:p>
         </w:tc>
@@ -27249,7 +25846,7 @@
                 <w:sz w:val="18"/>
                 <w:szCs w:val="18"/>
               </w:rPr>
-              <w:t xml:space="preserve">2 y 3</w:t>
+              <w:t xml:space="preserve"/>
             </w:r>
           </w:p>
         </w:tc>
@@ -27444,7 +26041,7 @@
                 <w:sz w:val="18"/>
                 <w:szCs w:val="18"/>
               </w:rPr>
-              <w:t xml:space="preserve">Solo 3</w:t>
+              <w:t xml:space="preserve">Sí</w:t>
             </w:r>
           </w:p>
         </w:tc>
@@ -27646,7 +26243,7 @@
                 <w:sz w:val="18"/>
                 <w:szCs w:val="18"/>
               </w:rPr>
-              <w:t xml:space="preserve">2 y 3</w:t>
+              <w:t xml:space="preserve"/>
             </w:r>
           </w:p>
         </w:tc>
@@ -27841,7 +26438,7 @@
                 <w:sz w:val="18"/>
                 <w:szCs w:val="18"/>
               </w:rPr>
-              <w:t xml:space="preserve">2 y 3</w:t>
+              <w:t xml:space="preserve"/>
             </w:r>
           </w:p>
         </w:tc>
@@ -28043,7 +26640,7 @@
                 <w:sz w:val="18"/>
                 <w:szCs w:val="18"/>
               </w:rPr>
-              <w:t xml:space="preserve">2 y 3</w:t>
+              <w:t xml:space="preserve"/>
             </w:r>
           </w:p>
         </w:tc>
@@ -28238,7 +26835,7 @@
                 <w:sz w:val="18"/>
                 <w:szCs w:val="18"/>
               </w:rPr>
-              <w:t xml:space="preserve">2 y 3</w:t>
+              <w:t xml:space="preserve"/>
             </w:r>
           </w:p>
         </w:tc>
@@ -28440,7 +27037,7 @@
                 <w:sz w:val="18"/>
                 <w:szCs w:val="18"/>
               </w:rPr>
-              <w:t xml:space="preserve">2 y 3</w:t>
+              <w:t xml:space="preserve"/>
             </w:r>
           </w:p>
         </w:tc>
@@ -28635,7 +27232,7 @@
                 <w:sz w:val="18"/>
                 <w:szCs w:val="18"/>
               </w:rPr>
-              <w:t xml:space="preserve">2 y 3</w:t>
+              <w:t xml:space="preserve"/>
             </w:r>
           </w:p>
         </w:tc>

</xml_diff>